<commit_message>
swimming worksheet version 2 added
</commit_message>
<xml_diff>
--- a/swimming/olympic_swimming_100m/olympic_swimming_ws.docx
+++ b/swimming/olympic_swimming_100m/olympic_swimming_ws.docx
@@ -1,161 +1,294 @@
 
 <file path=word/document.xml><?xml version="1.0" encoding="utf-8"?>
-<w:document xmlns:wpc="http://schemas.microsoft.com/office/word/2010/wordprocessingCanvas" xmlns:cx="http://schemas.microsoft.com/office/drawing/2014/chartex" xmlns:cx1="http://schemas.microsoft.com/office/drawing/2015/9/8/chartex" xmlns:mc="http://schemas.openxmlformats.org/markup-compatibility/2006" xmlns:o="urn:schemas-microsoft-com:office:office" xmlns:r="http://schemas.openxmlformats.org/officeDocument/2006/relationships" xmlns:m="http://schemas.openxmlformats.org/officeDocument/2006/math" xmlns:v="urn:schemas-microsoft-com:vml" xmlns:wp14="http://schemas.microsoft.com/office/word/2010/wordprocessingDrawing" xmlns:wp="http://schemas.openxmlformats.org/drawingml/2006/wordprocessingDrawing" xmlns:w10="urn:schemas-microsoft-com:office:word" xmlns:w="http://schemas.openxmlformats.org/wordprocessingml/2006/main" xmlns:w14="http://schemas.microsoft.com/office/word/2010/wordml" xmlns:w15="http://schemas.microsoft.com/office/word/2012/wordml" xmlns:w16se="http://schemas.microsoft.com/office/word/2015/wordml/symex" xmlns:wpg="http://schemas.microsoft.com/office/word/2010/wordprocessingGroup" xmlns:wpi="http://schemas.microsoft.com/office/word/2010/wordprocessingInk" xmlns:wne="http://schemas.microsoft.com/office/word/2006/wordml" xmlns:wps="http://schemas.microsoft.com/office/word/2010/wordprocessingShape" mc:Ignorable="w14 w15 w16se wp14">
+<w:document xmlns:wpc="http://schemas.microsoft.com/office/word/2010/wordprocessingCanvas" xmlns:cx="http://schemas.microsoft.com/office/drawing/2014/chartex" xmlns:cx1="http://schemas.microsoft.com/office/drawing/2015/9/8/chartex" xmlns:cx2="http://schemas.microsoft.com/office/drawing/2015/10/21/chartex" xmlns:cx3="http://schemas.microsoft.com/office/drawing/2016/5/9/chartex" xmlns:cx4="http://schemas.microsoft.com/office/drawing/2016/5/10/chartex" xmlns:cx5="http://schemas.microsoft.com/office/drawing/2016/5/11/chartex" xmlns:cx6="http://schemas.microsoft.com/office/drawing/2016/5/12/chartex" xmlns:cx7="http://schemas.microsoft.com/office/drawing/2016/5/13/chartex" xmlns:cx8="http://schemas.microsoft.com/office/drawing/2016/5/14/chartex" xmlns:mc="http://schemas.openxmlformats.org/markup-compatibility/2006" xmlns:aink="http://schemas.microsoft.com/office/drawing/2016/ink" xmlns:am3d="http://schemas.microsoft.com/office/drawing/2017/model3d" xmlns:o="urn:schemas-microsoft-com:office:office" xmlns:oel="http://schemas.microsoft.com/office/2019/extlst" xmlns:r="http://schemas.openxmlformats.org/officeDocument/2006/relationships" xmlns:m="http://schemas.openxmlformats.org/officeDocument/2006/math" xmlns:v="urn:schemas-microsoft-com:vml" xmlns:wp14="http://schemas.microsoft.com/office/word/2010/wordprocessingDrawing" xmlns:wp="http://schemas.openxmlformats.org/drawingml/2006/wordprocessingDrawing" xmlns:w10="urn:schemas-microsoft-com:office:word" xmlns:w="http://schemas.openxmlformats.org/wordprocessingml/2006/main" xmlns:w14="http://schemas.microsoft.com/office/word/2010/wordml" xmlns:w15="http://schemas.microsoft.com/office/word/2012/wordml" xmlns:w16cex="http://schemas.microsoft.com/office/word/2018/wordml/cex" xmlns:w16cid="http://schemas.microsoft.com/office/word/2016/wordml/cid" xmlns:w16="http://schemas.microsoft.com/office/word/2018/wordml" xmlns:w16du="http://schemas.microsoft.com/office/word/2023/wordml/word16du" xmlns:w16sdtdh="http://schemas.microsoft.com/office/word/2020/wordml/sdtdatahash" xmlns:w16sdtfl="http://schemas.microsoft.com/office/word/2024/wordml/sdtformatlock" xmlns:w16se="http://schemas.microsoft.com/office/word/2015/wordml/symex" xmlns:wpg="http://schemas.microsoft.com/office/word/2010/wordprocessingGroup" xmlns:wpi="http://schemas.microsoft.com/office/word/2010/wordprocessingInk" xmlns:wne="http://schemas.microsoft.com/office/word/2006/wordml" xmlns:wps="http://schemas.microsoft.com/office/word/2010/wordprocessingShape" mc:Ignorable="w14 w15 w16se w16cid w16 w16cex w16sdtdh w16sdtfl w16du wp14">
   <w:body>
     <w:p>
       <w:pPr>
-        <w:spacing w:line="480" w:lineRule="auto"/>
-        <w:jc w:val="center"/>
-        <w:rPr>
-          <w:rFonts w:ascii="Times New Roman" w:hAnsi="Times New Roman" w:cs="Times New Roman"/>
+        <w:spacing w:before="100" w:beforeAutospacing="1" w:after="100" w:afterAutospacing="1" w:line="240" w:lineRule="auto"/>
+        <w:rPr>
+          <w:rFonts w:ascii="Times New Roman" w:eastAsia="Times New Roman" w:hAnsi="Times New Roman" w:cs="Times New Roman"/>
+          <w:kern w:val="0"/>
+          <w:sz w:val="24"/>
+          <w:szCs w:val="24"/>
+          <w14:ligatures w14:val="none"/>
+        </w:rPr>
+      </w:pPr>
+      <w:r>
+        <w:rPr>
+          <w:rFonts w:ascii="Times New Roman" w:eastAsia="Times New Roman" w:hAnsi="Times New Roman" w:cs="Times New Roman"/>
+          <w:kern w:val="0"/>
+          <w:sz w:val="24"/>
+          <w:szCs w:val="24"/>
+          <w14:ligatures w14:val="none"/>
+        </w:rPr>
+        <w:t xml:space="preserve">In Olympic swimming, athletes compete using different </w:t>
+      </w:r>
+      <w:r>
+        <w:rPr>
+          <w:rFonts w:ascii="Times New Roman" w:eastAsia="Times New Roman" w:hAnsi="Times New Roman" w:cs="Times New Roman"/>
           <w:b/>
           <w:bCs/>
-          <w:sz w:val="24"/>
-          <w:szCs w:val="24"/>
-        </w:rPr>
-      </w:pPr>
-      <w:r>
-        <w:rPr>
-          <w:rFonts w:ascii="Times New Roman" w:hAnsi="Times New Roman" w:cs="Times New Roman"/>
+          <w:kern w:val="0"/>
+          <w:sz w:val="24"/>
+          <w:szCs w:val="24"/>
+          <w14:ligatures w14:val="none"/>
+        </w:rPr>
+        <w:t>strokes</w:t>
+      </w:r>
+      <w:r>
+        <w:rPr>
+          <w:rFonts w:ascii="Times New Roman" w:eastAsia="Times New Roman" w:hAnsi="Times New Roman" w:cs="Times New Roman"/>
+          <w:kern w:val="0"/>
+          <w:sz w:val="24"/>
+          <w:szCs w:val="24"/>
+          <w14:ligatures w14:val="none"/>
+        </w:rPr>
+        <w:t>, each with unique strengths and challenges:</w:t>
+      </w:r>
+    </w:p>
+    <w:p>
+      <w:pPr>
+        <w:numPr>
+          <w:ilvl w:val="0"/>
+          <w:numId w:val="9"/>
+        </w:numPr>
+        <w:spacing w:before="100" w:beforeAutospacing="1" w:after="100" w:afterAutospacing="1" w:line="240" w:lineRule="auto"/>
+        <w:rPr>
+          <w:rFonts w:ascii="Times New Roman" w:eastAsia="Times New Roman" w:hAnsi="Times New Roman" w:cs="Times New Roman"/>
+          <w:kern w:val="0"/>
+          <w:sz w:val="24"/>
+          <w:szCs w:val="24"/>
+          <w14:ligatures w14:val="none"/>
+        </w:rPr>
+      </w:pPr>
+      <w:r>
+        <w:rPr>
+          <w:rFonts w:ascii="Times New Roman" w:eastAsia="Times New Roman" w:hAnsi="Times New Roman" w:cs="Times New Roman"/>
           <w:b/>
           <w:bCs/>
-          <w:sz w:val="24"/>
-          <w:szCs w:val="24"/>
-        </w:rPr>
-        <w:t>Analyzing Olympic Swim Times with Boxplots and Confidence Intervals</w:t>
-      </w:r>
-    </w:p>
-    <w:p>
-      <w:pPr>
+          <w:kern w:val="0"/>
+          <w:sz w:val="24"/>
+          <w:szCs w:val="24"/>
+          <w14:ligatures w14:val="none"/>
+        </w:rPr>
+        <w:t>Freestyle</w:t>
+      </w:r>
+      <w:r>
+        <w:rPr>
+          <w:rFonts w:ascii="Times New Roman" w:eastAsia="Times New Roman" w:hAnsi="Times New Roman" w:cs="Times New Roman"/>
+          <w:kern w:val="0"/>
+          <w:sz w:val="24"/>
+          <w:szCs w:val="24"/>
+          <w14:ligatures w14:val="none"/>
+        </w:rPr>
+        <w:t xml:space="preserve"> is usually the fastest, with alternating arm strokes and a flutter kick.</w:t>
+      </w:r>
+    </w:p>
+    <w:p>
+      <w:pPr>
+        <w:numPr>
+          <w:ilvl w:val="0"/>
+          <w:numId w:val="9"/>
+        </w:numPr>
+        <w:spacing w:before="100" w:beforeAutospacing="1" w:after="100" w:afterAutospacing="1" w:line="240" w:lineRule="auto"/>
+        <w:rPr>
+          <w:rFonts w:ascii="Times New Roman" w:eastAsia="Times New Roman" w:hAnsi="Times New Roman" w:cs="Times New Roman"/>
+          <w:kern w:val="0"/>
+          <w:sz w:val="24"/>
+          <w:szCs w:val="24"/>
+          <w14:ligatures w14:val="none"/>
+        </w:rPr>
+      </w:pPr>
+      <w:r>
+        <w:rPr>
+          <w:rFonts w:ascii="Times New Roman" w:eastAsia="Times New Roman" w:hAnsi="Times New Roman" w:cs="Times New Roman"/>
+          <w:b/>
+          <w:bCs/>
+          <w:kern w:val="0"/>
+          <w:sz w:val="24"/>
+          <w:szCs w:val="24"/>
+          <w14:ligatures w14:val="none"/>
+        </w:rPr>
+        <w:t>Butterfly</w:t>
+      </w:r>
+      <w:r>
+        <w:rPr>
+          <w:rFonts w:ascii="Times New Roman" w:eastAsia="Times New Roman" w:hAnsi="Times New Roman" w:cs="Times New Roman"/>
+          <w:kern w:val="0"/>
+          <w:sz w:val="24"/>
+          <w:szCs w:val="24"/>
+          <w14:ligatures w14:val="none"/>
+        </w:rPr>
+        <w:t xml:space="preserve"> is powerful but demanding, requiring both arms to move together with a dolphin kick.</w:t>
+      </w:r>
+    </w:p>
+    <w:p>
+      <w:pPr>
+        <w:numPr>
+          <w:ilvl w:val="0"/>
+          <w:numId w:val="9"/>
+        </w:numPr>
+        <w:spacing w:before="100" w:beforeAutospacing="1" w:after="100" w:afterAutospacing="1" w:line="240" w:lineRule="auto"/>
+        <w:rPr>
+          <w:rFonts w:ascii="Times New Roman" w:eastAsia="Times New Roman" w:hAnsi="Times New Roman" w:cs="Times New Roman"/>
+          <w:kern w:val="0"/>
+          <w:sz w:val="24"/>
+          <w:szCs w:val="24"/>
+          <w14:ligatures w14:val="none"/>
+        </w:rPr>
+      </w:pPr>
+      <w:r>
+        <w:rPr>
+          <w:rFonts w:ascii="Times New Roman" w:eastAsia="Times New Roman" w:hAnsi="Times New Roman" w:cs="Times New Roman"/>
+          <w:b/>
+          <w:bCs/>
+          <w:kern w:val="0"/>
+          <w:sz w:val="24"/>
+          <w:szCs w:val="24"/>
+          <w14:ligatures w14:val="none"/>
+        </w:rPr>
+        <w:t>Backstroke</w:t>
+      </w:r>
+      <w:r>
+        <w:rPr>
+          <w:rFonts w:ascii="Times New Roman" w:eastAsia="Times New Roman" w:hAnsi="Times New Roman" w:cs="Times New Roman"/>
+          <w:kern w:val="0"/>
+          <w:sz w:val="24"/>
+          <w:szCs w:val="24"/>
+          <w14:ligatures w14:val="none"/>
+        </w:rPr>
+        <w:t xml:space="preserve"> is swum on the back, which makes breathing easier but navigation harder.</w:t>
+      </w:r>
+    </w:p>
+    <w:p>
+      <w:pPr>
+        <w:spacing w:before="100" w:beforeAutospacing="1" w:after="100" w:afterAutospacing="1" w:line="240" w:lineRule="auto"/>
+        <w:rPr>
+          <w:rFonts w:ascii="Times New Roman" w:eastAsia="Times New Roman" w:hAnsi="Times New Roman" w:cs="Times New Roman"/>
+          <w:kern w:val="0"/>
+          <w:sz w:val="24"/>
+          <w:szCs w:val="24"/>
+          <w14:ligatures w14:val="none"/>
+        </w:rPr>
+      </w:pPr>
+      <w:r>
+        <w:rPr>
+          <w:rFonts w:ascii="Times New Roman" w:eastAsia="Times New Roman" w:hAnsi="Times New Roman" w:cs="Times New Roman"/>
+          <w:kern w:val="0"/>
+          <w:sz w:val="24"/>
+          <w:szCs w:val="24"/>
+          <w14:ligatures w14:val="none"/>
+        </w:rPr>
+        <w:t xml:space="preserve">This dataset includes results from nearly 200 women who competed in the 100m Olympic events between 1964 and 2020. Over this period, </w:t>
+      </w:r>
+      <w:proofErr w:type="gramStart"/>
+      <w:r>
+        <w:rPr>
+          <w:rFonts w:ascii="Times New Roman" w:eastAsia="Times New Roman" w:hAnsi="Times New Roman" w:cs="Times New Roman"/>
+          <w:kern w:val="0"/>
+          <w:sz w:val="24"/>
+          <w:szCs w:val="24"/>
+          <w14:ligatures w14:val="none"/>
+        </w:rPr>
+        <w:t>performances have</w:t>
+      </w:r>
+      <w:proofErr w:type="gramEnd"/>
+      <w:r>
+        <w:rPr>
+          <w:rFonts w:ascii="Times New Roman" w:eastAsia="Times New Roman" w:hAnsi="Times New Roman" w:cs="Times New Roman"/>
+          <w:kern w:val="0"/>
+          <w:sz w:val="24"/>
+          <w:szCs w:val="24"/>
+          <w14:ligatures w14:val="none"/>
+        </w:rPr>
+        <w:t xml:space="preserve"> been shaped by advances in training, new technologies such as high-tech swimsuits, rule changes like the 15-meter underwater limit, and the growth of women’s participation in the sport.</w:t>
+      </w:r>
+    </w:p>
+    <w:p>
+      <w:pPr>
+        <w:pStyle w:val="ListParagraph"/>
+        <w:numPr>
+          <w:ilvl w:val="1"/>
+          <w:numId w:val="9"/>
+        </w:numPr>
         <w:spacing w:line="240" w:lineRule="auto"/>
-        <w:rPr>
-          <w:rFonts w:ascii="Times New Roman" w:hAnsi="Times New Roman" w:cs="Times New Roman"/>
-          <w:strike/>
-          <w:sz w:val="24"/>
-          <w:szCs w:val="24"/>
-        </w:rPr>
-      </w:pPr>
-      <w:r>
-        <w:rPr>
-          <w:rFonts w:ascii="Times New Roman" w:hAnsi="Times New Roman" w:cs="Times New Roman"/>
-          <w:strike/>
-          <w:sz w:val="24"/>
-          <w:szCs w:val="24"/>
-        </w:rPr>
-        <w:t>The Summer Olympics are traditionally held every four years, with an extensive history that goes back to 1896. Since then, swimming has been an integral part of the events. The sport has attracted thousands of athletes from over 150 countries around the world. The Olympics allows nations to put aside their differences and come together to provide a sense of unity to millions of fans.</w:t>
+        <w:ind w:left="360"/>
+        <w:rPr>
+          <w:rFonts w:ascii="Times New Roman" w:hAnsi="Times New Roman" w:cs="Times New Roman"/>
+          <w:sz w:val="24"/>
+          <w:szCs w:val="24"/>
+        </w:rPr>
+      </w:pPr>
+      <w:r>
+        <w:rPr>
+          <w:rFonts w:ascii="Times New Roman" w:hAnsi="Times New Roman" w:cs="Times New Roman"/>
+          <w:sz w:val="24"/>
+          <w:szCs w:val="24"/>
+        </w:rPr>
+        <w:t>The side-by-side boxplots below display race times</w:t>
+      </w:r>
+      <w:r>
+        <w:rPr>
+          <w:rFonts w:ascii="Times New Roman" w:hAnsi="Times New Roman" w:cs="Times New Roman"/>
+          <w:sz w:val="24"/>
+          <w:szCs w:val="24"/>
+        </w:rPr>
+        <w:t xml:space="preserve"> (in seconds)</w:t>
+      </w:r>
+      <w:r>
+        <w:rPr>
+          <w:rFonts w:ascii="Times New Roman" w:hAnsi="Times New Roman" w:cs="Times New Roman"/>
+          <w:sz w:val="24"/>
+          <w:szCs w:val="24"/>
+        </w:rPr>
+        <w:t xml:space="preserve"> for different strokes in the Women’s 100m event. Use it</w:t>
+      </w:r>
+      <w:r>
+        <w:rPr>
+          <w:rFonts w:ascii="Times New Roman" w:hAnsi="Times New Roman" w:cs="Times New Roman"/>
+          <w:sz w:val="24"/>
+          <w:szCs w:val="24"/>
+        </w:rPr>
+        <w:t>, along with the associated summary statistics,</w:t>
+      </w:r>
+      <w:r>
+        <w:rPr>
+          <w:rFonts w:ascii="Times New Roman" w:hAnsi="Times New Roman" w:cs="Times New Roman"/>
+          <w:sz w:val="24"/>
+          <w:szCs w:val="24"/>
+        </w:rPr>
+        <w:t xml:space="preserve"> to answer the questions below.</w:t>
+      </w:r>
+      <w:r>
+        <w:rPr>
+          <w:rFonts w:ascii="Times New Roman" w:hAnsi="Times New Roman" w:cs="Times New Roman"/>
+          <w:sz w:val="24"/>
+          <w:szCs w:val="24"/>
+        </w:rPr>
+        <w:t xml:space="preserve"> </w:t>
       </w:r>
     </w:p>
     <w:p>
       <w:pPr>
         <w:spacing w:line="240" w:lineRule="auto"/>
-        <w:rPr>
-          <w:rFonts w:ascii="Times New Roman" w:hAnsi="Times New Roman" w:cs="Times New Roman"/>
-          <w:strike/>
-          <w:sz w:val="24"/>
-          <w:szCs w:val="24"/>
-        </w:rPr>
-      </w:pPr>
-      <w:r>
-        <w:rPr>
-          <w:rFonts w:ascii="Times New Roman" w:hAnsi="Times New Roman" w:cs="Times New Roman"/>
-          <w:strike/>
-          <w:sz w:val="24"/>
-          <w:szCs w:val="24"/>
-        </w:rPr>
-        <w:t xml:space="preserve">We will be investigating the results of the Women’s 100-meter race from 1964 to 2020. The dataset includes 194 swimmers and 10 variables. </w:t>
-      </w:r>
-    </w:p>
-    <w:p>
-      <w:pPr>
-        <w:spacing w:line="240" w:lineRule="auto"/>
-        <w:rPr>
-          <w:rFonts w:ascii="Times New Roman" w:hAnsi="Times New Roman" w:cs="Times New Roman"/>
-          <w:strike/>
-          <w:sz w:val="24"/>
-          <w:szCs w:val="24"/>
-        </w:rPr>
-      </w:pPr>
-      <w:r>
-        <w:rPr>
-          <w:rFonts w:ascii="Times New Roman" w:hAnsi="Times New Roman" w:cs="Times New Roman"/>
-          <w:strike/>
-          <w:sz w:val="24"/>
-          <w:szCs w:val="24"/>
-        </w:rPr>
-        <w:t>Our main goals are to find which styles of swimming are the best for the 100m race and whether race times have changed significantly from 1964 to 2020. Each style of swimming has its own advantages and disadvantages. The backstroke makes breathing easier but makes it difficult for the swimmer to know where he is going. The butterfly stroke makes breathing easier because the swimmer’s head spends significant time out of the water, however it requires lots of strength and timing. The freestyle stroke uses your full body and is easiest to learn, however the swimmer keeps their head in the water most of the time so it can be difficult to breathe.</w:t>
-      </w:r>
-    </w:p>
-    <w:p>
-      <w:pPr>
-        <w:spacing w:line="240" w:lineRule="auto"/>
-        <w:rPr>
-          <w:rFonts w:ascii="Times New Roman" w:hAnsi="Times New Roman" w:cs="Times New Roman"/>
-          <w:sz w:val="24"/>
-          <w:szCs w:val="24"/>
-        </w:rPr>
-      </w:pPr>
-    </w:p>
-    <w:p>
-      <w:pPr>
-        <w:spacing w:line="240" w:lineRule="auto"/>
-        <w:rPr>
-          <w:rFonts w:ascii="Times New Roman" w:hAnsi="Times New Roman" w:cs="Times New Roman"/>
-          <w:sz w:val="24"/>
-          <w:szCs w:val="24"/>
-        </w:rPr>
-      </w:pPr>
-      <w:r>
-        <w:rPr>
-          <w:rFonts w:ascii="Times New Roman" w:hAnsi="Times New Roman" w:cs="Times New Roman"/>
-          <w:sz w:val="24"/>
-          <w:szCs w:val="24"/>
-        </w:rPr>
-        <w:t>The side-by-side boxplots below display race times for different strokes in the Women’s 100m event. Use it</w:t>
-      </w:r>
-      <w:r>
-        <w:rPr>
-          <w:rFonts w:ascii="Times New Roman" w:hAnsi="Times New Roman" w:cs="Times New Roman"/>
-          <w:sz w:val="24"/>
-          <w:szCs w:val="24"/>
-        </w:rPr>
-        <w:t>, along with the associated table of summary statistics,</w:t>
-      </w:r>
-      <w:r>
-        <w:rPr>
-          <w:rFonts w:ascii="Times New Roman" w:hAnsi="Times New Roman" w:cs="Times New Roman"/>
-          <w:sz w:val="24"/>
-          <w:szCs w:val="24"/>
-        </w:rPr>
-        <w:t xml:space="preserve"> to answer the questions below.</w:t>
-      </w:r>
-      <w:r>
-        <w:rPr>
-          <w:rFonts w:ascii="Times New Roman" w:hAnsi="Times New Roman" w:cs="Times New Roman"/>
-          <w:sz w:val="24"/>
-          <w:szCs w:val="24"/>
-        </w:rPr>
-        <w:t xml:space="preserve"> </w:t>
-      </w:r>
-    </w:p>
-    <w:p>
-      <w:pPr>
-        <w:spacing w:line="240" w:lineRule="auto"/>
-        <w:rPr>
-          <w:rFonts w:ascii="Times New Roman" w:hAnsi="Times New Roman" w:cs="Times New Roman"/>
-          <w:sz w:val="24"/>
-          <w:szCs w:val="24"/>
-        </w:rPr>
-      </w:pPr>
-      <w:r>
-        <w:rPr>
-          <w:rFonts w:ascii="Times New Roman" w:hAnsi="Times New Roman" w:cs="Times New Roman"/>
+        <w:jc w:val="center"/>
+        <w:rPr>
+          <w:rFonts w:ascii="Times New Roman" w:hAnsi="Times New Roman" w:cs="Times New Roman"/>
+          <w:sz w:val="24"/>
+          <w:szCs w:val="24"/>
+        </w:rPr>
+      </w:pPr>
+      <w:r>
+        <w:rPr>
+          <w:rFonts w:ascii="Times New Roman" w:hAnsi="Times New Roman" w:cs="Times New Roman"/>
+          <w:noProof/>
           <w:sz w:val="24"/>
           <w:szCs w:val="24"/>
         </w:rPr>
         <w:drawing>
-          <wp:inline distT="0" distB="0" distL="0" distR="0" wp14:anchorId="56AFDB32" wp14:editId="3C48A460">
-            <wp:extent cx="4080510" cy="2720340"/>
-            <wp:effectExtent l="0" t="0" r="0" b="3810"/>
+          <wp:inline distT="0" distB="0" distL="0" distR="0" wp14:anchorId="56AFDB32" wp14:editId="4D8E8741">
+            <wp:extent cx="3405116" cy="2270077"/>
+            <wp:effectExtent l="0" t="0" r="5080" b="0"/>
             <wp:docPr id="1" name="Picture 1"/>
             <wp:cNvGraphicFramePr>
               <a:graphicFrameLocks xmlns:a="http://schemas.openxmlformats.org/drawingml/2006/main" noChangeAspect="1"/>
@@ -176,7 +309,7 @@
                   <pic:spPr>
                     <a:xfrm>
                       <a:off x="0" y="0"/>
-                      <a:ext cx="4080510" cy="2720340"/>
+                      <a:ext cx="3414601" cy="2276401"/>
                     </a:xfrm>
                     <a:prstGeom prst="rect">
                       <a:avLst/>
@@ -189,26 +322,10 @@
         </w:drawing>
       </w:r>
     </w:p>
-    <w:p>
-      <w:pPr>
-        <w:autoSpaceDE w:val="0"/>
-        <w:autoSpaceDN w:val="0"/>
-        <w:adjustRightInd w:val="0"/>
-        <w:spacing w:after="96" w:line="240" w:lineRule="auto"/>
-        <w:rPr>
-          <w:rFonts w:ascii="Segoe UI" w:eastAsia="Times New Roman" w:hAnsi="Segoe UI" w:cs="Segoe UI"/>
-          <w:b/>
-          <w:bCs/>
-          <w:color w:val="056EB2"/>
-          <w:kern w:val="0"/>
-          <w:sz w:val="19"/>
-          <w:szCs w:val="19"/>
-        </w:rPr>
-      </w:pPr>
-    </w:p>
     <w:tbl>
       <w:tblPr>
         <w:tblW w:w="0" w:type="auto"/>
+        <w:jc w:val="center"/>
         <w:tblCellMar>
           <w:left w:w="60" w:type="dxa"/>
           <w:right w:w="60" w:type="dxa"/>
@@ -228,14 +345,9 @@
         <w:gridCol w:w="1100"/>
       </w:tblGrid>
       <w:tr>
-        <w:tblPrEx>
-          <w:tblCellMar>
-            <w:top w:w="0" w:type="dxa"/>
-            <w:bottom w:w="0" w:type="dxa"/>
-          </w:tblCellMar>
-        </w:tblPrEx>
         <w:trPr>
           <w:trHeight w:val="298"/>
+          <w:jc w:val="center"/>
         </w:trPr>
         <w:tc>
           <w:tcPr>
@@ -709,14 +821,9 @@
         </w:tc>
       </w:tr>
       <w:tr>
-        <w:tblPrEx>
-          <w:tblCellMar>
-            <w:top w:w="0" w:type="dxa"/>
-            <w:bottom w:w="0" w:type="dxa"/>
-          </w:tblCellMar>
-        </w:tblPrEx>
         <w:trPr>
           <w:trHeight w:val="228"/>
+          <w:jc w:val="center"/>
         </w:trPr>
         <w:tc>
           <w:tcPr>
@@ -1147,14 +1254,9 @@
         </w:tc>
       </w:tr>
       <w:tr>
-        <w:tblPrEx>
-          <w:tblCellMar>
-            <w:top w:w="0" w:type="dxa"/>
-            <w:bottom w:w="0" w:type="dxa"/>
-          </w:tblCellMar>
-        </w:tblPrEx>
         <w:trPr>
           <w:trHeight w:val="228"/>
+          <w:jc w:val="center"/>
         </w:trPr>
         <w:tc>
           <w:tcPr>
@@ -1583,14 +1685,9 @@
         </w:tc>
       </w:tr>
       <w:tr>
-        <w:tblPrEx>
-          <w:tblCellMar>
-            <w:top w:w="0" w:type="dxa"/>
-            <w:bottom w:w="0" w:type="dxa"/>
-          </w:tblCellMar>
-        </w:tblPrEx>
         <w:trPr>
           <w:trHeight w:val="246"/>
+          <w:jc w:val="center"/>
         </w:trPr>
         <w:tc>
           <w:tcPr>
@@ -2037,49 +2134,24 @@
     </w:p>
     <w:p>
       <w:pPr>
-        <w:autoSpaceDE w:val="0"/>
-        <w:autoSpaceDN w:val="0"/>
-        <w:adjustRightInd w:val="0"/>
-        <w:spacing w:after="0" w:line="240" w:lineRule="auto"/>
-        <w:rPr>
-          <w:rFonts w:ascii="system-ui" w:eastAsia="Times New Roman" w:hAnsi="system-ui" w:cs="system-ui"/>
-          <w:color w:val="000000"/>
-          <w:kern w:val="0"/>
-          <w:sz w:val="14"/>
-          <w:szCs w:val="14"/>
-        </w:rPr>
-      </w:pPr>
-    </w:p>
-    <w:p>
-      <w:pPr>
-        <w:spacing w:line="240" w:lineRule="auto"/>
-        <w:rPr>
-          <w:rFonts w:ascii="Times New Roman" w:hAnsi="Times New Roman" w:cs="Times New Roman"/>
-          <w:sz w:val="24"/>
-          <w:szCs w:val="24"/>
-        </w:rPr>
-      </w:pPr>
-    </w:p>
-    <w:p>
-      <w:pPr>
         <w:pStyle w:val="ListParagraph"/>
         <w:numPr>
           <w:ilvl w:val="0"/>
-          <w:numId w:val="1"/>
+          <w:numId w:val="10"/>
         </w:numPr>
-        <w:rPr>
-          <w:rFonts w:ascii="Times New Roman" w:hAnsi="Times New Roman" w:cs="Times New Roman"/>
-          <w:sz w:val="24"/>
-          <w:szCs w:val="24"/>
-        </w:rPr>
-      </w:pPr>
-      <w:r>
-        <w:rPr>
-          <w:rFonts w:ascii="Times New Roman" w:hAnsi="Times New Roman" w:cs="Times New Roman"/>
-          <w:sz w:val="24"/>
-          <w:szCs w:val="24"/>
-        </w:rPr>
-        <w:lastRenderedPageBreak/>
+        <w:ind w:left="1080"/>
+        <w:rPr>
+          <w:rFonts w:ascii="Times New Roman" w:hAnsi="Times New Roman" w:cs="Times New Roman"/>
+          <w:sz w:val="24"/>
+          <w:szCs w:val="24"/>
+        </w:rPr>
+      </w:pPr>
+      <w:r>
+        <w:rPr>
+          <w:rFonts w:ascii="Times New Roman" w:hAnsi="Times New Roman" w:cs="Times New Roman"/>
+          <w:sz w:val="24"/>
+          <w:szCs w:val="24"/>
+        </w:rPr>
         <w:t>Interpret the side-by-side boxplots above. Be sure to compare medians</w:t>
       </w:r>
       <w:r>
@@ -2110,6 +2182,7 @@
     <w:p>
       <w:pPr>
         <w:pStyle w:val="ListParagraph"/>
+        <w:ind w:left="0"/>
         <w:rPr>
           <w:rFonts w:ascii="Times New Roman" w:hAnsi="Times New Roman" w:cs="Times New Roman"/>
           <w:sz w:val="24"/>
@@ -2120,6 +2193,7 @@
     <w:p>
       <w:pPr>
         <w:pStyle w:val="ListParagraph"/>
+        <w:ind w:left="0"/>
         <w:rPr>
           <w:rFonts w:ascii="Times New Roman" w:hAnsi="Times New Roman" w:cs="Times New Roman"/>
           <w:sz w:val="24"/>
@@ -2130,6 +2204,7 @@
     <w:p>
       <w:pPr>
         <w:pStyle w:val="ListParagraph"/>
+        <w:ind w:left="0"/>
         <w:rPr>
           <w:rFonts w:ascii="Times New Roman" w:hAnsi="Times New Roman" w:cs="Times New Roman"/>
           <w:sz w:val="24"/>
@@ -2140,6 +2215,7 @@
     <w:p>
       <w:pPr>
         <w:pStyle w:val="ListParagraph"/>
+        <w:ind w:left="0"/>
         <w:rPr>
           <w:rFonts w:ascii="Times New Roman" w:hAnsi="Times New Roman" w:cs="Times New Roman"/>
           <w:sz w:val="24"/>
@@ -2150,6 +2226,7 @@
     <w:p>
       <w:pPr>
         <w:pStyle w:val="ListParagraph"/>
+        <w:ind w:left="0"/>
         <w:rPr>
           <w:rFonts w:ascii="Times New Roman" w:hAnsi="Times New Roman" w:cs="Times New Roman"/>
           <w:sz w:val="24"/>
@@ -2160,6 +2237,7 @@
     <w:p>
       <w:pPr>
         <w:pStyle w:val="ListParagraph"/>
+        <w:ind w:left="0"/>
         <w:rPr>
           <w:rFonts w:ascii="Times New Roman" w:hAnsi="Times New Roman" w:cs="Times New Roman"/>
           <w:sz w:val="24"/>
@@ -2170,6 +2248,29 @@
     <w:p>
       <w:pPr>
         <w:pStyle w:val="ListParagraph"/>
+        <w:ind w:left="0"/>
+        <w:rPr>
+          <w:rFonts w:ascii="Times New Roman" w:hAnsi="Times New Roman" w:cs="Times New Roman"/>
+          <w:sz w:val="24"/>
+          <w:szCs w:val="24"/>
+        </w:rPr>
+      </w:pPr>
+    </w:p>
+    <w:p>
+      <w:pPr>
+        <w:pStyle w:val="ListParagraph"/>
+        <w:ind w:left="0"/>
+        <w:rPr>
+          <w:rFonts w:ascii="Times New Roman" w:hAnsi="Times New Roman" w:cs="Times New Roman"/>
+          <w:sz w:val="24"/>
+          <w:szCs w:val="24"/>
+        </w:rPr>
+      </w:pPr>
+    </w:p>
+    <w:p>
+      <w:pPr>
+        <w:pStyle w:val="ListParagraph"/>
+        <w:ind w:left="0"/>
         <w:rPr>
           <w:rFonts w:ascii="Times New Roman" w:hAnsi="Times New Roman" w:cs="Times New Roman"/>
           <w:sz w:val="24"/>
@@ -2182,20 +2283,22 @@
         <w:pStyle w:val="ListParagraph"/>
         <w:numPr>
           <w:ilvl w:val="0"/>
-          <w:numId w:val="1"/>
+          <w:numId w:val="10"/>
         </w:numPr>
-        <w:rPr>
-          <w:rFonts w:ascii="Times New Roman" w:hAnsi="Times New Roman" w:cs="Times New Roman"/>
-          <w:sz w:val="24"/>
-          <w:szCs w:val="24"/>
-        </w:rPr>
-      </w:pPr>
-      <w:r>
-        <w:rPr>
-          <w:rFonts w:ascii="Times New Roman" w:hAnsi="Times New Roman" w:cs="Times New Roman"/>
-          <w:sz w:val="24"/>
-          <w:szCs w:val="24"/>
-        </w:rPr>
+        <w:ind w:left="1080"/>
+        <w:rPr>
+          <w:rFonts w:ascii="Times New Roman" w:hAnsi="Times New Roman" w:cs="Times New Roman"/>
+          <w:sz w:val="24"/>
+          <w:szCs w:val="24"/>
+        </w:rPr>
+      </w:pPr>
+      <w:r>
+        <w:rPr>
+          <w:rFonts w:ascii="Times New Roman" w:hAnsi="Times New Roman" w:cs="Times New Roman"/>
+          <w:sz w:val="24"/>
+          <w:szCs w:val="24"/>
+        </w:rPr>
+        <w:lastRenderedPageBreak/>
         <w:t xml:space="preserve">Most experienced swimmers know that freestyle tends to be the fastest. Assuming the swimmers in our dataset represent a random sample of elite female swimmers, calculate and interpret a 95% confidence interval for the difference in mean finishing times between freestyle and butterfly. Be sure your interpretation directly answers the question: </w:t>
       </w:r>
       <w:r>
@@ -2212,6 +2315,7 @@
     <w:p>
       <w:pPr>
         <w:pStyle w:val="ListParagraph"/>
+        <w:ind w:left="0"/>
         <w:rPr>
           <w:rFonts w:ascii="Times New Roman" w:hAnsi="Times New Roman" w:cs="Times New Roman"/>
           <w:color w:val="FF0000"/>
@@ -2223,6 +2327,7 @@
     <w:p>
       <w:pPr>
         <w:pStyle w:val="ListParagraph"/>
+        <w:ind w:left="0"/>
         <w:rPr>
           <w:rFonts w:ascii="Times New Roman" w:hAnsi="Times New Roman" w:cs="Times New Roman"/>
           <w:color w:val="FF0000"/>
@@ -2234,6 +2339,7 @@
     <w:p>
       <w:pPr>
         <w:pStyle w:val="ListParagraph"/>
+        <w:ind w:left="0"/>
         <w:rPr>
           <w:rFonts w:ascii="Times New Roman" w:hAnsi="Times New Roman" w:cs="Times New Roman"/>
           <w:color w:val="FF0000"/>
@@ -2245,6 +2351,7 @@
     <w:p>
       <w:pPr>
         <w:pStyle w:val="ListParagraph"/>
+        <w:ind w:left="0"/>
         <w:rPr>
           <w:rFonts w:ascii="Times New Roman" w:hAnsi="Times New Roman" w:cs="Times New Roman"/>
           <w:color w:val="FF0000"/>
@@ -2256,6 +2363,7 @@
     <w:p>
       <w:pPr>
         <w:pStyle w:val="ListParagraph"/>
+        <w:ind w:left="0"/>
         <w:rPr>
           <w:rFonts w:ascii="Times New Roman" w:hAnsi="Times New Roman" w:cs="Times New Roman"/>
           <w:color w:val="FF0000"/>
@@ -2267,6 +2375,7 @@
     <w:p>
       <w:pPr>
         <w:pStyle w:val="ListParagraph"/>
+        <w:ind w:left="0"/>
         <w:rPr>
           <w:rFonts w:ascii="Times New Roman" w:hAnsi="Times New Roman" w:cs="Times New Roman"/>
           <w:color w:val="FF0000"/>
@@ -2278,6 +2387,7 @@
     <w:p>
       <w:pPr>
         <w:pStyle w:val="ListParagraph"/>
+        <w:ind w:left="0"/>
         <w:rPr>
           <w:rFonts w:ascii="Times New Roman" w:hAnsi="Times New Roman" w:cs="Times New Roman"/>
           <w:color w:val="FF0000"/>
@@ -2288,6 +2398,48 @@
     </w:p>
     <w:p>
       <w:pPr>
+        <w:pStyle w:val="ListParagraph"/>
+        <w:ind w:left="0"/>
+        <w:rPr>
+          <w:rFonts w:ascii="Times New Roman" w:hAnsi="Times New Roman" w:cs="Times New Roman"/>
+          <w:color w:val="FF0000"/>
+          <w:sz w:val="24"/>
+          <w:szCs w:val="24"/>
+        </w:rPr>
+      </w:pPr>
+    </w:p>
+    <w:p>
+      <w:pPr>
+        <w:pStyle w:val="ListParagraph"/>
+        <w:ind w:left="0"/>
+        <w:rPr>
+          <w:rFonts w:ascii="Times New Roman" w:hAnsi="Times New Roman" w:cs="Times New Roman"/>
+          <w:color w:val="FF0000"/>
+          <w:sz w:val="24"/>
+          <w:szCs w:val="24"/>
+        </w:rPr>
+      </w:pPr>
+    </w:p>
+    <w:p>
+      <w:pPr>
+        <w:pStyle w:val="ListParagraph"/>
+        <w:ind w:left="0"/>
+        <w:rPr>
+          <w:rFonts w:ascii="Times New Roman" w:hAnsi="Times New Roman" w:cs="Times New Roman"/>
+          <w:color w:val="FF0000"/>
+          <w:sz w:val="24"/>
+          <w:szCs w:val="24"/>
+        </w:rPr>
+      </w:pPr>
+    </w:p>
+    <w:p>
+      <w:pPr>
+        <w:pStyle w:val="ListParagraph"/>
+        <w:numPr>
+          <w:ilvl w:val="1"/>
+          <w:numId w:val="9"/>
+        </w:numPr>
+        <w:ind w:left="360"/>
         <w:rPr>
           <w:rFonts w:ascii="Times New Roman" w:hAnsi="Times New Roman" w:cs="Times New Roman"/>
           <w:sz w:val="24"/>
@@ -2327,25 +2479,7 @@
           <w:sz w:val="24"/>
           <w:szCs w:val="24"/>
         </w:rPr>
-        <w:t>(</w:t>
-      </w:r>
-      <w:r>
-        <w:rPr>
-          <w:rFonts w:ascii="Times New Roman" w:hAnsi="Times New Roman" w:cs="Times New Roman"/>
-          <w:bCs/>
-          <w:sz w:val="24"/>
-          <w:szCs w:val="24"/>
-        </w:rPr>
-        <w:t>before</w:t>
-      </w:r>
-      <w:r>
-        <w:rPr>
-          <w:rFonts w:ascii="Times New Roman" w:hAnsi="Times New Roman" w:cs="Times New Roman"/>
-          <w:bCs/>
-          <w:sz w:val="24"/>
-          <w:szCs w:val="24"/>
-        </w:rPr>
-        <w:t xml:space="preserve"> 2000)</w:t>
+        <w:t>(before 2000)</w:t>
       </w:r>
       <w:r>
         <w:rPr>
@@ -2405,6 +2539,11 @@
           <w:ilvl w:val="0"/>
           <w:numId w:val="2"/>
         </w:numPr>
+        <w:tabs>
+          <w:tab w:val="clear" w:pos="1800"/>
+          <w:tab w:val="num" w:pos="720"/>
+        </w:tabs>
+        <w:ind w:left="720"/>
         <w:rPr>
           <w:rFonts w:ascii="Times New Roman" w:hAnsi="Times New Roman" w:cs="Times New Roman"/>
           <w:sz w:val="24"/>
@@ -2426,6 +2565,11 @@
           <w:ilvl w:val="0"/>
           <w:numId w:val="2"/>
         </w:numPr>
+        <w:tabs>
+          <w:tab w:val="clear" w:pos="1800"/>
+          <w:tab w:val="num" w:pos="720"/>
+        </w:tabs>
+        <w:ind w:left="720"/>
         <w:rPr>
           <w:rFonts w:ascii="Times New Roman" w:hAnsi="Times New Roman" w:cs="Times New Roman"/>
           <w:sz w:val="24"/>
@@ -2465,6 +2609,11 @@
           <w:ilvl w:val="0"/>
           <w:numId w:val="2"/>
         </w:numPr>
+        <w:tabs>
+          <w:tab w:val="clear" w:pos="1800"/>
+          <w:tab w:val="num" w:pos="720"/>
+        </w:tabs>
+        <w:ind w:left="720"/>
         <w:rPr>
           <w:rFonts w:ascii="Times New Roman" w:hAnsi="Times New Roman" w:cs="Times New Roman"/>
           <w:sz w:val="24"/>
@@ -2494,6 +2643,11 @@
           <w:ilvl w:val="0"/>
           <w:numId w:val="2"/>
         </w:numPr>
+        <w:tabs>
+          <w:tab w:val="clear" w:pos="1800"/>
+          <w:tab w:val="num" w:pos="720"/>
+        </w:tabs>
+        <w:ind w:left="720"/>
         <w:rPr>
           <w:rFonts w:ascii="Times New Roman" w:hAnsi="Times New Roman" w:cs="Times New Roman"/>
           <w:sz w:val="24"/>
@@ -2544,6 +2698,7 @@
     <w:p>
       <w:pPr>
         <w:pStyle w:val="ListParagraph"/>
+        <w:ind w:left="0"/>
         <w:rPr>
           <w:rFonts w:ascii="Times New Roman" w:hAnsi="Times New Roman" w:cs="Times New Roman"/>
           <w:sz w:val="24"/>
@@ -2554,6 +2709,7 @@
     <w:p>
       <w:pPr>
         <w:pStyle w:val="ListParagraph"/>
+        <w:ind w:left="0"/>
         <w:jc w:val="center"/>
         <w:rPr>
           <w:rFonts w:ascii="Times New Roman" w:hAnsi="Times New Roman" w:cs="Times New Roman"/>
@@ -2564,14 +2720,14 @@
       <w:r>
         <w:rPr>
           <w:rFonts w:ascii="Times New Roman" w:hAnsi="Times New Roman" w:cs="Times New Roman"/>
-          <w:sz w:val="24"/>
-          <w:szCs w:val="24"/>
-        </w:rPr>
-        <w:lastRenderedPageBreak/>
+          <w:noProof/>
+          <w:sz w:val="24"/>
+          <w:szCs w:val="24"/>
+        </w:rPr>
         <w:drawing>
-          <wp:inline distT="0" distB="0" distL="0" distR="0" wp14:anchorId="03C7A4F4" wp14:editId="167BB11D">
-            <wp:extent cx="5943600" cy="3962400"/>
-            <wp:effectExtent l="0" t="0" r="0" b="0"/>
+          <wp:inline distT="0" distB="0" distL="0" distR="0" wp14:anchorId="03C7A4F4" wp14:editId="509D156F">
+            <wp:extent cx="3930555" cy="2620370"/>
+            <wp:effectExtent l="0" t="0" r="0" b="8890"/>
             <wp:docPr id="3" name="Picture 3"/>
             <wp:cNvGraphicFramePr>
               <a:graphicFrameLocks xmlns:a="http://schemas.openxmlformats.org/drawingml/2006/main" noChangeAspect="1"/>
@@ -2592,7 +2748,7 @@
                   <pic:spPr>
                     <a:xfrm>
                       <a:off x="0" y="0"/>
-                      <a:ext cx="5943600" cy="3962400"/>
+                      <a:ext cx="3949662" cy="2633108"/>
                     </a:xfrm>
                     <a:prstGeom prst="rect">
                       <a:avLst/>
@@ -2608,28 +2764,313 @@
     <w:p>
       <w:pPr>
         <w:pStyle w:val="ListParagraph"/>
-        <w:jc w:val="center"/>
-        <w:rPr>
-          <w:rFonts w:ascii="Times New Roman" w:hAnsi="Times New Roman" w:cs="Times New Roman"/>
-          <w:sz w:val="24"/>
-          <w:szCs w:val="24"/>
-        </w:rPr>
-      </w:pPr>
+        <w:numPr>
+          <w:ilvl w:val="0"/>
+          <w:numId w:val="11"/>
+        </w:numPr>
+        <w:ind w:left="1080"/>
+        <w:rPr>
+          <w:rFonts w:ascii="Times New Roman" w:hAnsi="Times New Roman" w:cs="Times New Roman"/>
+          <w:sz w:val="24"/>
+          <w:szCs w:val="24"/>
+        </w:rPr>
+      </w:pPr>
+      <w:r>
+        <w:rPr>
+          <w:rFonts w:ascii="Times New Roman" w:hAnsi="Times New Roman" w:cs="Times New Roman"/>
+          <w:sz w:val="24"/>
+          <w:szCs w:val="24"/>
+        </w:rPr>
+        <w:lastRenderedPageBreak/>
+        <w:t>The boxplots above show finishing times for the women’s 100m event</w:t>
+      </w:r>
+      <w:r>
+        <w:rPr>
+          <w:rFonts w:ascii="Times New Roman" w:hAnsi="Times New Roman" w:cs="Times New Roman"/>
+          <w:sz w:val="24"/>
+          <w:szCs w:val="24"/>
+        </w:rPr>
+        <w:t>s</w:t>
+      </w:r>
+      <w:r>
+        <w:rPr>
+          <w:rFonts w:ascii="Times New Roman" w:hAnsi="Times New Roman" w:cs="Times New Roman"/>
+          <w:sz w:val="24"/>
+          <w:szCs w:val="24"/>
+        </w:rPr>
+        <w:t xml:space="preserve">, split into </w:t>
+      </w:r>
+      <w:r>
+        <w:rPr>
+          <w:rFonts w:ascii="Times New Roman" w:hAnsi="Times New Roman" w:cs="Times New Roman"/>
+          <w:b/>
+          <w:bCs/>
+          <w:sz w:val="24"/>
+          <w:szCs w:val="24"/>
+        </w:rPr>
+        <w:t xml:space="preserve">early </w:t>
+      </w:r>
+      <w:r>
+        <w:rPr>
+          <w:rFonts w:ascii="Times New Roman" w:hAnsi="Times New Roman" w:cs="Times New Roman"/>
+          <w:sz w:val="24"/>
+          <w:szCs w:val="24"/>
+        </w:rPr>
+        <w:t xml:space="preserve">and </w:t>
+      </w:r>
+      <w:r>
+        <w:rPr>
+          <w:rFonts w:ascii="Times New Roman" w:hAnsi="Times New Roman" w:cs="Times New Roman"/>
+          <w:b/>
+          <w:bCs/>
+          <w:sz w:val="24"/>
+          <w:szCs w:val="24"/>
+        </w:rPr>
+        <w:t>recent</w:t>
+      </w:r>
+      <w:r>
+        <w:rPr>
+          <w:rFonts w:ascii="Times New Roman" w:hAnsi="Times New Roman" w:cs="Times New Roman"/>
+          <w:sz w:val="24"/>
+          <w:szCs w:val="24"/>
+        </w:rPr>
+        <w:t xml:space="preserve"> eras.</w:t>
+      </w:r>
+      <w:r>
+        <w:rPr>
+          <w:rFonts w:ascii="Times New Roman" w:hAnsi="Times New Roman" w:cs="Times New Roman"/>
+          <w:sz w:val="24"/>
+          <w:szCs w:val="24"/>
+        </w:rPr>
+        <w:t xml:space="preserve"> </w:t>
+      </w:r>
+      <w:r>
+        <w:rPr>
+          <w:rFonts w:ascii="Times New Roman" w:hAnsi="Times New Roman" w:cs="Times New Roman"/>
+          <w:sz w:val="24"/>
+          <w:szCs w:val="24"/>
+        </w:rPr>
+        <w:t>Compare the distributions within each stroke (butterfly, freestyle).</w:t>
+      </w:r>
     </w:p>
     <w:p>
       <w:pPr>
         <w:pStyle w:val="ListParagraph"/>
-        <w:jc w:val="center"/>
-        <w:rPr>
-          <w:rFonts w:ascii="Times New Roman" w:hAnsi="Times New Roman" w:cs="Times New Roman"/>
-          <w:sz w:val="24"/>
-          <w:szCs w:val="24"/>
-        </w:rPr>
-      </w:pPr>
+        <w:numPr>
+          <w:ilvl w:val="1"/>
+          <w:numId w:val="12"/>
+        </w:numPr>
+        <w:rPr>
+          <w:rFonts w:ascii="Times New Roman" w:hAnsi="Times New Roman" w:cs="Times New Roman"/>
+          <w:sz w:val="24"/>
+          <w:szCs w:val="24"/>
+        </w:rPr>
+      </w:pPr>
+      <w:r>
+        <w:rPr>
+          <w:rFonts w:ascii="Times New Roman" w:hAnsi="Times New Roman" w:cs="Times New Roman"/>
+          <w:sz w:val="24"/>
+          <w:szCs w:val="24"/>
+        </w:rPr>
+        <w:t>Which stroke shows the largest improvement in times from the early to recent era?</w:t>
+      </w:r>
     </w:p>
     <w:p>
       <w:pPr>
         <w:pStyle w:val="ListParagraph"/>
+        <w:ind w:left="1440"/>
+        <w:rPr>
+          <w:rFonts w:ascii="Times New Roman" w:hAnsi="Times New Roman" w:cs="Times New Roman"/>
+          <w:sz w:val="24"/>
+          <w:szCs w:val="24"/>
+        </w:rPr>
+      </w:pPr>
+    </w:p>
+    <w:p>
+      <w:pPr>
+        <w:pStyle w:val="ListParagraph"/>
+        <w:ind w:left="1440"/>
+        <w:rPr>
+          <w:rFonts w:ascii="Times New Roman" w:hAnsi="Times New Roman" w:cs="Times New Roman"/>
+          <w:sz w:val="24"/>
+          <w:szCs w:val="24"/>
+        </w:rPr>
+      </w:pPr>
+    </w:p>
+    <w:p>
+      <w:pPr>
+        <w:pStyle w:val="ListParagraph"/>
+        <w:ind w:left="1440"/>
+        <w:rPr>
+          <w:rFonts w:ascii="Times New Roman" w:hAnsi="Times New Roman" w:cs="Times New Roman"/>
+          <w:sz w:val="24"/>
+          <w:szCs w:val="24"/>
+        </w:rPr>
+      </w:pPr>
+    </w:p>
+    <w:p>
+      <w:pPr>
+        <w:pStyle w:val="ListParagraph"/>
+        <w:ind w:left="1440"/>
+        <w:rPr>
+          <w:rFonts w:ascii="Times New Roman" w:hAnsi="Times New Roman" w:cs="Times New Roman"/>
+          <w:sz w:val="24"/>
+          <w:szCs w:val="24"/>
+        </w:rPr>
+      </w:pPr>
+    </w:p>
+    <w:p>
+      <w:pPr>
+        <w:pStyle w:val="ListParagraph"/>
+        <w:ind w:left="1440"/>
+        <w:rPr>
+          <w:rFonts w:ascii="Times New Roman" w:hAnsi="Times New Roman" w:cs="Times New Roman"/>
+          <w:sz w:val="24"/>
+          <w:szCs w:val="24"/>
+        </w:rPr>
+      </w:pPr>
+    </w:p>
+    <w:p>
+      <w:pPr>
+        <w:pStyle w:val="ListParagraph"/>
+        <w:numPr>
+          <w:ilvl w:val="1"/>
+          <w:numId w:val="12"/>
+        </w:numPr>
+        <w:rPr>
+          <w:rFonts w:ascii="Times New Roman" w:hAnsi="Times New Roman" w:cs="Times New Roman"/>
+          <w:sz w:val="24"/>
+          <w:szCs w:val="24"/>
+        </w:rPr>
+      </w:pPr>
+      <w:r>
+        <w:rPr>
+          <w:rFonts w:ascii="Times New Roman" w:hAnsi="Times New Roman" w:cs="Times New Roman"/>
+          <w:sz w:val="24"/>
+          <w:szCs w:val="24"/>
+        </w:rPr>
+        <w:t>How does the consistency (spread of times) change in the recent era compared to the early era?</w:t>
+      </w:r>
+    </w:p>
+    <w:p>
+      <w:pPr>
+        <w:pStyle w:val="ListParagraph"/>
+        <w:ind w:left="1440"/>
+        <w:rPr>
+          <w:rFonts w:ascii="Times New Roman" w:hAnsi="Times New Roman" w:cs="Times New Roman"/>
+          <w:sz w:val="24"/>
+          <w:szCs w:val="24"/>
+        </w:rPr>
+      </w:pPr>
+    </w:p>
+    <w:p>
+      <w:pPr>
+        <w:pStyle w:val="ListParagraph"/>
+        <w:ind w:left="1440"/>
+        <w:rPr>
+          <w:rFonts w:ascii="Times New Roman" w:hAnsi="Times New Roman" w:cs="Times New Roman"/>
+          <w:sz w:val="24"/>
+          <w:szCs w:val="24"/>
+        </w:rPr>
+      </w:pPr>
+    </w:p>
+    <w:p>
+      <w:pPr>
+        <w:pStyle w:val="ListParagraph"/>
+        <w:ind w:left="1440"/>
+        <w:rPr>
+          <w:rFonts w:ascii="Times New Roman" w:hAnsi="Times New Roman" w:cs="Times New Roman"/>
+          <w:sz w:val="24"/>
+          <w:szCs w:val="24"/>
+        </w:rPr>
+      </w:pPr>
+    </w:p>
+    <w:p>
+      <w:pPr>
+        <w:pStyle w:val="ListParagraph"/>
+        <w:ind w:left="1440"/>
+        <w:rPr>
+          <w:rFonts w:ascii="Times New Roman" w:hAnsi="Times New Roman" w:cs="Times New Roman"/>
+          <w:sz w:val="24"/>
+          <w:szCs w:val="24"/>
+        </w:rPr>
+      </w:pPr>
+    </w:p>
+    <w:p>
+      <w:pPr>
+        <w:pStyle w:val="ListParagraph"/>
+        <w:ind w:left="1440"/>
+        <w:rPr>
+          <w:rFonts w:ascii="Times New Roman" w:hAnsi="Times New Roman" w:cs="Times New Roman"/>
+          <w:sz w:val="24"/>
+          <w:szCs w:val="24"/>
+        </w:rPr>
+      </w:pPr>
+    </w:p>
+    <w:p>
+      <w:pPr>
+        <w:pStyle w:val="ListParagraph"/>
+        <w:numPr>
+          <w:ilvl w:val="1"/>
+          <w:numId w:val="12"/>
+        </w:numPr>
+        <w:rPr>
+          <w:rFonts w:ascii="Times New Roman" w:hAnsi="Times New Roman" w:cs="Times New Roman"/>
+          <w:sz w:val="24"/>
+          <w:szCs w:val="24"/>
+        </w:rPr>
+      </w:pPr>
+      <w:r>
+        <w:rPr>
+          <w:rFonts w:ascii="Times New Roman" w:hAnsi="Times New Roman" w:cs="Times New Roman"/>
+          <w:sz w:val="24"/>
+          <w:szCs w:val="24"/>
+        </w:rPr>
+        <w:t xml:space="preserve">Recall: the women’s 100m backstroke was only introduced in 2008, so there are no “early” </w:t>
+      </w:r>
+      <w:r>
+        <w:rPr>
+          <w:rFonts w:ascii="Times New Roman" w:hAnsi="Times New Roman" w:cs="Times New Roman"/>
+          <w:sz w:val="24"/>
+          <w:szCs w:val="24"/>
+        </w:rPr>
+        <w:t>Olympic</w:t>
+      </w:r>
+      <w:r>
+        <w:rPr>
+          <w:rFonts w:ascii="Times New Roman" w:hAnsi="Times New Roman" w:cs="Times New Roman"/>
+          <w:sz w:val="24"/>
+          <w:szCs w:val="24"/>
+        </w:rPr>
+        <w:t xml:space="preserve"> </w:t>
+      </w:r>
+      <w:r>
+        <w:rPr>
+          <w:rFonts w:ascii="Times New Roman" w:hAnsi="Times New Roman" w:cs="Times New Roman"/>
+          <w:sz w:val="24"/>
+          <w:szCs w:val="24"/>
+        </w:rPr>
+        <w:t>results for that event. However, if there had been, sketch what you think the early backstroke boxplot might look like</w:t>
+      </w:r>
+      <w:r>
+        <w:rPr>
+          <w:rFonts w:ascii="Times New Roman" w:hAnsi="Times New Roman" w:cs="Times New Roman"/>
+          <w:sz w:val="24"/>
+          <w:szCs w:val="24"/>
+        </w:rPr>
+        <w:t xml:space="preserve"> on the plot above</w:t>
+      </w:r>
+      <w:r>
+        <w:rPr>
+          <w:rFonts w:ascii="Times New Roman" w:hAnsi="Times New Roman" w:cs="Times New Roman"/>
+          <w:sz w:val="24"/>
+          <w:szCs w:val="24"/>
+        </w:rPr>
+        <w:t>. Base your sketch on the patterns you observed in butterfly and freestyle.</w:t>
+      </w:r>
+    </w:p>
+    <w:p>
+      <w:pPr>
         <w:rPr>
           <w:rFonts w:ascii="Times New Roman" w:hAnsi="Times New Roman" w:cs="Times New Roman"/>
           <w:sz w:val="24"/>
@@ -2642,196 +3083,9 @@
         <w:pStyle w:val="ListParagraph"/>
         <w:numPr>
           <w:ilvl w:val="0"/>
-          <w:numId w:val="1"/>
+          <w:numId w:val="11"/>
         </w:numPr>
-        <w:rPr>
-          <w:rFonts w:ascii="Times New Roman" w:hAnsi="Times New Roman" w:cs="Times New Roman"/>
-          <w:sz w:val="24"/>
-          <w:szCs w:val="24"/>
-        </w:rPr>
-      </w:pPr>
-      <w:r>
-        <w:rPr>
-          <w:rFonts w:ascii="Times New Roman" w:hAnsi="Times New Roman" w:cs="Times New Roman"/>
-          <w:sz w:val="24"/>
-          <w:szCs w:val="24"/>
-        </w:rPr>
-        <w:t>The boxplots above show finishing times for the women’s 100m event</w:t>
-      </w:r>
-      <w:r>
-        <w:rPr>
-          <w:rFonts w:ascii="Times New Roman" w:hAnsi="Times New Roman" w:cs="Times New Roman"/>
-          <w:sz w:val="24"/>
-          <w:szCs w:val="24"/>
-        </w:rPr>
-        <w:t>s</w:t>
-      </w:r>
-      <w:r>
-        <w:rPr>
-          <w:rFonts w:ascii="Times New Roman" w:hAnsi="Times New Roman" w:cs="Times New Roman"/>
-          <w:sz w:val="24"/>
-          <w:szCs w:val="24"/>
-        </w:rPr>
-        <w:t xml:space="preserve">, split into </w:t>
-      </w:r>
-      <w:r>
-        <w:rPr>
-          <w:rFonts w:ascii="Times New Roman" w:hAnsi="Times New Roman" w:cs="Times New Roman"/>
-          <w:b/>
-          <w:bCs/>
-          <w:sz w:val="24"/>
-          <w:szCs w:val="24"/>
-        </w:rPr>
-        <w:t xml:space="preserve">early </w:t>
-      </w:r>
-      <w:r>
-        <w:rPr>
-          <w:rFonts w:ascii="Times New Roman" w:hAnsi="Times New Roman" w:cs="Times New Roman"/>
-          <w:sz w:val="24"/>
-          <w:szCs w:val="24"/>
-        </w:rPr>
-        <w:t xml:space="preserve">and </w:t>
-      </w:r>
-      <w:r>
-        <w:rPr>
-          <w:rFonts w:ascii="Times New Roman" w:hAnsi="Times New Roman" w:cs="Times New Roman"/>
-          <w:b/>
-          <w:bCs/>
-          <w:sz w:val="24"/>
-          <w:szCs w:val="24"/>
-        </w:rPr>
-        <w:t>recent</w:t>
-      </w:r>
-      <w:r>
-        <w:rPr>
-          <w:rFonts w:ascii="Times New Roman" w:hAnsi="Times New Roman" w:cs="Times New Roman"/>
-          <w:sz w:val="24"/>
-          <w:szCs w:val="24"/>
-        </w:rPr>
-        <w:t xml:space="preserve"> eras.</w:t>
-      </w:r>
-      <w:r>
-        <w:rPr>
-          <w:rFonts w:ascii="Times New Roman" w:hAnsi="Times New Roman" w:cs="Times New Roman"/>
-          <w:sz w:val="24"/>
-          <w:szCs w:val="24"/>
-        </w:rPr>
-        <w:t xml:space="preserve"> </w:t>
-      </w:r>
-      <w:r>
-        <w:rPr>
-          <w:rFonts w:ascii="Times New Roman" w:hAnsi="Times New Roman" w:cs="Times New Roman"/>
-          <w:sz w:val="24"/>
-          <w:szCs w:val="24"/>
-        </w:rPr>
-        <w:t>Compare the distributions within each stroke (butterfly, freestyle).</w:t>
-      </w:r>
-    </w:p>
-    <w:p>
-      <w:pPr>
-        <w:pStyle w:val="ListParagraph"/>
-        <w:numPr>
-          <w:ilvl w:val="1"/>
-          <w:numId w:val="7"/>
-        </w:numPr>
-        <w:rPr>
-          <w:rFonts w:ascii="Times New Roman" w:hAnsi="Times New Roman" w:cs="Times New Roman"/>
-          <w:sz w:val="24"/>
-          <w:szCs w:val="24"/>
-        </w:rPr>
-      </w:pPr>
-      <w:r>
-        <w:rPr>
-          <w:rFonts w:ascii="Times New Roman" w:hAnsi="Times New Roman" w:cs="Times New Roman"/>
-          <w:sz w:val="24"/>
-          <w:szCs w:val="24"/>
-        </w:rPr>
-        <w:t>Which stroke shows the largest improvement in times from the early to recent era?</w:t>
-      </w:r>
-    </w:p>
-    <w:p>
-      <w:pPr>
-        <w:pStyle w:val="ListParagraph"/>
-        <w:numPr>
-          <w:ilvl w:val="1"/>
-          <w:numId w:val="7"/>
-        </w:numPr>
-        <w:rPr>
-          <w:rFonts w:ascii="Times New Roman" w:hAnsi="Times New Roman" w:cs="Times New Roman"/>
-          <w:sz w:val="24"/>
-          <w:szCs w:val="24"/>
-        </w:rPr>
-      </w:pPr>
-      <w:r>
-        <w:rPr>
-          <w:rFonts w:ascii="Times New Roman" w:hAnsi="Times New Roman" w:cs="Times New Roman"/>
-          <w:sz w:val="24"/>
-          <w:szCs w:val="24"/>
-        </w:rPr>
-        <w:t>How does the consistency (spread of times) change in the recent era compared to the early era?</w:t>
-      </w:r>
-    </w:p>
-    <w:p>
-      <w:pPr>
-        <w:pStyle w:val="ListParagraph"/>
-        <w:numPr>
-          <w:ilvl w:val="1"/>
-          <w:numId w:val="7"/>
-        </w:numPr>
-        <w:rPr>
-          <w:rFonts w:ascii="Times New Roman" w:hAnsi="Times New Roman" w:cs="Times New Roman"/>
-          <w:sz w:val="24"/>
-          <w:szCs w:val="24"/>
-        </w:rPr>
-      </w:pPr>
-      <w:r>
-        <w:rPr>
-          <w:rFonts w:ascii="Times New Roman" w:hAnsi="Times New Roman" w:cs="Times New Roman"/>
-          <w:sz w:val="24"/>
-          <w:szCs w:val="24"/>
-        </w:rPr>
-        <w:t>Recall: the women’s 100m backstroke was only introduced in 2008, so there are no actual “early” results for that event. However, if there had be</w:t>
-      </w:r>
-      <w:bookmarkStart w:id="0" w:name="_GoBack"/>
-      <w:bookmarkEnd w:id="0"/>
-      <w:r>
-        <w:rPr>
-          <w:rFonts w:ascii="Times New Roman" w:hAnsi="Times New Roman" w:cs="Times New Roman"/>
-          <w:sz w:val="24"/>
-          <w:szCs w:val="24"/>
-        </w:rPr>
-        <w:t>en, sketch what you think the early backstroke boxplot might look like</w:t>
-      </w:r>
-      <w:r>
-        <w:rPr>
-          <w:rFonts w:ascii="Times New Roman" w:hAnsi="Times New Roman" w:cs="Times New Roman"/>
-          <w:sz w:val="24"/>
-          <w:szCs w:val="24"/>
-        </w:rPr>
-        <w:t xml:space="preserve"> on the plot above</w:t>
-      </w:r>
-      <w:r>
-        <w:rPr>
-          <w:rFonts w:ascii="Times New Roman" w:hAnsi="Times New Roman" w:cs="Times New Roman"/>
-          <w:sz w:val="24"/>
-          <w:szCs w:val="24"/>
-        </w:rPr>
-        <w:t>. Base your sketch on the patterns you observed in butterfly and freestyle.</w:t>
-      </w:r>
-    </w:p>
-    <w:p>
-      <w:pPr>
-        <w:pStyle w:val="ListParagraph"/>
-        <w:jc w:val="center"/>
-        <w:rPr>
-          <w:rFonts w:ascii="Times New Roman" w:hAnsi="Times New Roman" w:cs="Times New Roman"/>
-          <w:sz w:val="24"/>
-          <w:szCs w:val="24"/>
-        </w:rPr>
-      </w:pPr>
-    </w:p>
-    <w:p>
-      <w:pPr>
+        <w:ind w:left="1080"/>
         <w:rPr>
           <w:rFonts w:ascii="Times New Roman" w:hAnsi="Times New Roman" w:cs="Times New Roman"/>
           <w:sz w:val="24"/>
@@ -2858,6 +3112,7 @@
     <w:tbl>
       <w:tblPr>
         <w:tblW w:w="0" w:type="auto"/>
+        <w:jc w:val="center"/>
         <w:tblCellMar>
           <w:left w:w="60" w:type="dxa"/>
           <w:right w:w="60" w:type="dxa"/>
@@ -2877,14 +3132,9 @@
         <w:gridCol w:w="1096"/>
       </w:tblGrid>
       <w:tr>
-        <w:tblPrEx>
-          <w:tblCellMar>
-            <w:top w:w="0" w:type="dxa"/>
-            <w:bottom w:w="0" w:type="dxa"/>
-          </w:tblCellMar>
-        </w:tblPrEx>
         <w:trPr>
           <w:trHeight w:val="298"/>
+          <w:jc w:val="center"/>
         </w:trPr>
         <w:tc>
           <w:tcPr>
@@ -3368,14 +3618,9 @@
         </w:tc>
       </w:tr>
       <w:tr>
-        <w:tblPrEx>
-          <w:tblCellMar>
-            <w:top w:w="0" w:type="dxa"/>
-            <w:bottom w:w="0" w:type="dxa"/>
-          </w:tblCellMar>
-        </w:tblPrEx>
         <w:trPr>
           <w:trHeight w:val="228"/>
+          <w:jc w:val="center"/>
         </w:trPr>
         <w:tc>
           <w:tcPr>
@@ -3807,14 +4052,9 @@
         </w:tc>
       </w:tr>
       <w:tr>
-        <w:tblPrEx>
-          <w:tblCellMar>
-            <w:top w:w="0" w:type="dxa"/>
-            <w:bottom w:w="0" w:type="dxa"/>
-          </w:tblCellMar>
-        </w:tblPrEx>
         <w:trPr>
           <w:trHeight w:val="228"/>
+          <w:jc w:val="center"/>
         </w:trPr>
         <w:tc>
           <w:tcPr>
@@ -4245,14 +4485,9 @@
         </w:tc>
       </w:tr>
       <w:tr>
-        <w:tblPrEx>
-          <w:tblCellMar>
-            <w:top w:w="0" w:type="dxa"/>
-            <w:bottom w:w="0" w:type="dxa"/>
-          </w:tblCellMar>
-        </w:tblPrEx>
         <w:trPr>
           <w:trHeight w:val="246"/>
+          <w:jc w:val="center"/>
         </w:trPr>
         <w:tc>
           <w:tcPr>
@@ -4701,6 +4936,7 @@
     <w:p>
       <w:pPr>
         <w:pStyle w:val="ListParagraph"/>
+        <w:ind w:left="0"/>
         <w:rPr>
           <w:rFonts w:ascii="Times New Roman" w:hAnsi="Times New Roman" w:cs="Times New Roman"/>
           <w:sz w:val="24"/>
@@ -4711,33 +4947,30 @@
     <w:p>
       <w:pPr>
         <w:pStyle w:val="ListParagraph"/>
-        <w:rPr>
-          <w:rFonts w:ascii="Times New Roman" w:hAnsi="Times New Roman" w:cs="Times New Roman"/>
-          <w:sz w:val="24"/>
-          <w:szCs w:val="24"/>
-        </w:rPr>
-      </w:pPr>
-    </w:p>
-    <w:p>
-      <w:pPr>
-        <w:pStyle w:val="ListParagraph"/>
-        <w:numPr>
-          <w:ilvl w:val="0"/>
-          <w:numId w:val="1"/>
-        </w:numPr>
-        <w:rPr>
-          <w:rFonts w:ascii="Times New Roman" w:hAnsi="Times New Roman" w:cs="Times New Roman"/>
-          <w:sz w:val="24"/>
-          <w:szCs w:val="24"/>
-        </w:rPr>
-      </w:pPr>
-      <w:r>
-        <w:rPr>
-          <w:rFonts w:ascii="Times New Roman" w:hAnsi="Times New Roman" w:cs="Times New Roman"/>
-          <w:sz w:val="24"/>
-          <w:szCs w:val="24"/>
-        </w:rPr>
-        <w:t>Again a</w:t>
+        <w:ind w:left="1080"/>
+        <w:rPr>
+          <w:rFonts w:ascii="Times New Roman" w:hAnsi="Times New Roman" w:cs="Times New Roman"/>
+          <w:sz w:val="24"/>
+          <w:szCs w:val="24"/>
+        </w:rPr>
+      </w:pPr>
+      <w:proofErr w:type="gramStart"/>
+      <w:r>
+        <w:rPr>
+          <w:rFonts w:ascii="Times New Roman" w:hAnsi="Times New Roman" w:cs="Times New Roman"/>
+          <w:sz w:val="24"/>
+          <w:szCs w:val="24"/>
+        </w:rPr>
+        <w:t>Again</w:t>
+      </w:r>
+      <w:proofErr w:type="gramEnd"/>
+      <w:r>
+        <w:rPr>
+          <w:rFonts w:ascii="Times New Roman" w:hAnsi="Times New Roman" w:cs="Times New Roman"/>
+          <w:sz w:val="24"/>
+          <w:szCs w:val="24"/>
+        </w:rPr>
+        <w:t xml:space="preserve"> a</w:t>
       </w:r>
       <w:r>
         <w:rPr>
@@ -4777,6 +5010,7 @@
     <w:p>
       <w:pPr>
         <w:pStyle w:val="ListParagraph"/>
+        <w:ind w:left="0"/>
         <w:rPr>
           <w:rFonts w:ascii="Times New Roman" w:hAnsi="Times New Roman" w:cs="Times New Roman"/>
           <w:color w:val="FF0000"/>
@@ -4788,6 +5022,7 @@
     <w:p>
       <w:pPr>
         <w:pStyle w:val="ListParagraph"/>
+        <w:ind w:left="0"/>
         <w:rPr>
           <w:rFonts w:ascii="Times New Roman" w:hAnsi="Times New Roman" w:cs="Times New Roman"/>
           <w:color w:val="FF0000"/>
@@ -4799,6 +5034,7 @@
     <w:p>
       <w:pPr>
         <w:pStyle w:val="ListParagraph"/>
+        <w:ind w:left="0"/>
         <w:rPr>
           <w:rFonts w:ascii="Times New Roman" w:hAnsi="Times New Roman" w:cs="Times New Roman"/>
           <w:color w:val="FF0000"/>
@@ -4810,6 +5046,7 @@
     <w:p>
       <w:pPr>
         <w:pStyle w:val="ListParagraph"/>
+        <w:ind w:left="0"/>
         <w:rPr>
           <w:rFonts w:ascii="Times New Roman" w:hAnsi="Times New Roman" w:cs="Times New Roman"/>
           <w:color w:val="FF0000"/>
@@ -4821,12 +5058,43 @@
     <w:p>
       <w:pPr>
         <w:pStyle w:val="ListParagraph"/>
+        <w:ind w:left="0"/>
         <w:rPr>
           <w:rFonts w:ascii="Times New Roman" w:hAnsi="Times New Roman" w:cs="Times New Roman"/>
           <w:color w:val="FF0000"/>
           <w:sz w:val="24"/>
           <w:szCs w:val="24"/>
         </w:rPr>
+      </w:pPr>
+    </w:p>
+    <w:p>
+      <w:pPr>
+        <w:pStyle w:val="ListParagraph"/>
+        <w:ind w:left="0"/>
+        <w:rPr>
+          <w:rFonts w:ascii="Times New Roman" w:hAnsi="Times New Roman" w:cs="Times New Roman"/>
+          <w:color w:val="FF0000"/>
+          <w:sz w:val="24"/>
+          <w:szCs w:val="24"/>
+        </w:rPr>
+      </w:pPr>
+    </w:p>
+    <w:p>
+      <w:pPr>
+        <w:pStyle w:val="ListParagraph"/>
+        <w:ind w:left="0"/>
+        <w:rPr>
+          <w:rFonts w:ascii="Times New Roman" w:hAnsi="Times New Roman" w:cs="Times New Roman"/>
+          <w:color w:val="FF0000"/>
+          <w:sz w:val="24"/>
+          <w:szCs w:val="24"/>
+        </w:rPr>
+      </w:pPr>
+    </w:p>
+    <w:p>
+      <w:pPr>
+        <w:pStyle w:val="NormalWeb"/>
+        <w:ind w:left="1080"/>
       </w:pPr>
     </w:p>
     <w:p>
@@ -4834,14 +5102,13 @@
         <w:pStyle w:val="NormalWeb"/>
         <w:numPr>
           <w:ilvl w:val="0"/>
-          <w:numId w:val="1"/>
+          <w:numId w:val="11"/>
         </w:numPr>
-      </w:pPr>
-      <w:r>
-        <w:t>Compare the confidence interval you found in Question 2 (all years) with the one from Question 4 (recent era).</w:t>
-      </w:r>
-      <w:r>
-        <w:t xml:space="preserve"> In particular, address:</w:t>
+        <w:ind w:left="1080"/>
+      </w:pPr>
+      <w:r>
+        <w:lastRenderedPageBreak/>
+        <w:t>Compare the confidence interval you found in Question 2 (all years) with the one from Question 4 (recent era). In particular, address:</w:t>
       </w:r>
     </w:p>
     <w:p>
@@ -4851,10 +5118,26 @@
           <w:ilvl w:val="0"/>
           <w:numId w:val="5"/>
         </w:numPr>
+        <w:tabs>
+          <w:tab w:val="num" w:pos="360"/>
+        </w:tabs>
+        <w:ind w:left="1440"/>
       </w:pPr>
       <w:r>
         <w:t>How are the two intervals similar or different?</w:t>
       </w:r>
+    </w:p>
+    <w:p>
+      <w:pPr>
+        <w:pStyle w:val="NormalWeb"/>
+        <w:ind w:left="1440"/>
+      </w:pPr>
+    </w:p>
+    <w:p>
+      <w:pPr>
+        <w:pStyle w:val="NormalWeb"/>
+        <w:ind w:left="1440"/>
+      </w:pPr>
     </w:p>
     <w:p>
       <w:pPr>
@@ -4863,6 +5146,10 @@
           <w:ilvl w:val="0"/>
           <w:numId w:val="5"/>
         </w:numPr>
+        <w:tabs>
+          <w:tab w:val="num" w:pos="360"/>
+        </w:tabs>
+        <w:ind w:left="1440"/>
       </w:pPr>
       <w:r>
         <w:t>What might explain any changes in the size or location of the intervals?</w:t>
@@ -4871,39 +5158,46 @@
     <w:p>
       <w:pPr>
         <w:pStyle w:val="ListParagraph"/>
+        <w:ind w:left="0"/>
         <w:rPr>
           <w:rFonts w:ascii="Times New Roman" w:hAnsi="Times New Roman" w:cs="Times New Roman"/>
           <w:color w:val="FF0000"/>
           <w:sz w:val="24"/>
           <w:szCs w:val="24"/>
+          <w:shd w:val="clear" w:color="auto" w:fill="FFFFFF"/>
         </w:rPr>
       </w:pPr>
     </w:p>
     <w:p>
       <w:pPr>
         <w:pStyle w:val="ListParagraph"/>
+        <w:ind w:left="0"/>
         <w:rPr>
           <w:rFonts w:ascii="Times New Roman" w:hAnsi="Times New Roman" w:cs="Times New Roman"/>
           <w:color w:val="FF0000"/>
           <w:sz w:val="24"/>
           <w:szCs w:val="24"/>
+          <w:shd w:val="clear" w:color="auto" w:fill="FFFFFF"/>
         </w:rPr>
       </w:pPr>
     </w:p>
     <w:p>
       <w:pPr>
         <w:pStyle w:val="ListParagraph"/>
+        <w:ind w:left="0"/>
         <w:rPr>
           <w:rFonts w:ascii="Times New Roman" w:hAnsi="Times New Roman" w:cs="Times New Roman"/>
           <w:color w:val="FF0000"/>
           <w:sz w:val="24"/>
           <w:szCs w:val="24"/>
+          <w:shd w:val="clear" w:color="auto" w:fill="FFFFFF"/>
         </w:rPr>
       </w:pPr>
     </w:p>
     <w:p>
       <w:pPr>
         <w:pStyle w:val="ListParagraph"/>
+        <w:ind w:left="0"/>
         <w:rPr>
           <w:rFonts w:ascii="Times New Roman" w:hAnsi="Times New Roman" w:cs="Times New Roman"/>
           <w:color w:val="FF0000"/>
@@ -4916,102 +5210,7 @@
     <w:p>
       <w:pPr>
         <w:pStyle w:val="ListParagraph"/>
-        <w:rPr>
-          <w:rFonts w:ascii="Times New Roman" w:hAnsi="Times New Roman" w:cs="Times New Roman"/>
-          <w:color w:val="FF0000"/>
-          <w:sz w:val="24"/>
-          <w:szCs w:val="24"/>
-          <w:shd w:val="clear" w:color="auto" w:fill="FFFFFF"/>
-        </w:rPr>
-      </w:pPr>
-    </w:p>
-    <w:p>
-      <w:pPr>
-        <w:pStyle w:val="ListParagraph"/>
-        <w:rPr>
-          <w:rFonts w:ascii="Times New Roman" w:hAnsi="Times New Roman" w:cs="Times New Roman"/>
-          <w:color w:val="FF0000"/>
-          <w:sz w:val="24"/>
-          <w:szCs w:val="24"/>
-          <w:shd w:val="clear" w:color="auto" w:fill="FFFFFF"/>
-        </w:rPr>
-      </w:pPr>
-    </w:p>
-    <w:p>
-      <w:pPr>
-        <w:pStyle w:val="ListParagraph"/>
-        <w:rPr>
-          <w:rFonts w:ascii="Times New Roman" w:hAnsi="Times New Roman" w:cs="Times New Roman"/>
-          <w:color w:val="FF0000"/>
-          <w:sz w:val="24"/>
-          <w:szCs w:val="24"/>
-          <w:shd w:val="clear" w:color="auto" w:fill="FFFFFF"/>
-        </w:rPr>
-      </w:pPr>
-    </w:p>
-    <w:p>
-      <w:pPr>
-        <w:pStyle w:val="ListParagraph"/>
-        <w:rPr>
-          <w:rFonts w:ascii="Times New Roman" w:hAnsi="Times New Roman" w:cs="Times New Roman"/>
-          <w:color w:val="FF0000"/>
-          <w:sz w:val="24"/>
-          <w:szCs w:val="24"/>
-          <w:shd w:val="clear" w:color="auto" w:fill="FFFFFF"/>
-        </w:rPr>
-      </w:pPr>
-    </w:p>
-    <w:p>
-      <w:pPr>
-        <w:pStyle w:val="ListParagraph"/>
-        <w:rPr>
-          <w:rFonts w:ascii="Times New Roman" w:hAnsi="Times New Roman" w:cs="Times New Roman"/>
-          <w:color w:val="FF0000"/>
-          <w:sz w:val="24"/>
-          <w:szCs w:val="24"/>
-          <w:shd w:val="clear" w:color="auto" w:fill="FFFFFF"/>
-        </w:rPr>
-      </w:pPr>
-    </w:p>
-    <w:p>
-      <w:pPr>
-        <w:pStyle w:val="ListParagraph"/>
-        <w:rPr>
-          <w:rFonts w:ascii="Times New Roman" w:hAnsi="Times New Roman" w:cs="Times New Roman"/>
-          <w:color w:val="FF0000"/>
-          <w:sz w:val="24"/>
-          <w:szCs w:val="24"/>
-          <w:shd w:val="clear" w:color="auto" w:fill="FFFFFF"/>
-        </w:rPr>
-      </w:pPr>
-    </w:p>
-    <w:p>
-      <w:pPr>
-        <w:pStyle w:val="ListParagraph"/>
-        <w:rPr>
-          <w:rFonts w:ascii="Times New Roman" w:hAnsi="Times New Roman" w:cs="Times New Roman"/>
-          <w:color w:val="FF0000"/>
-          <w:sz w:val="24"/>
-          <w:szCs w:val="24"/>
-          <w:shd w:val="clear" w:color="auto" w:fill="FFFFFF"/>
-        </w:rPr>
-      </w:pPr>
-    </w:p>
-    <w:p>
-      <w:pPr>
-        <w:pStyle w:val="ListParagraph"/>
-        <w:rPr>
-          <w:rFonts w:ascii="Times New Roman" w:hAnsi="Times New Roman" w:cs="Times New Roman"/>
-          <w:color w:val="FF0000"/>
-          <w:sz w:val="24"/>
-          <w:szCs w:val="24"/>
-          <w:shd w:val="clear" w:color="auto" w:fill="FFFFFF"/>
-        </w:rPr>
-      </w:pPr>
-    </w:p>
-    <w:p>
-      <w:pPr>
-        <w:pStyle w:val="ListParagraph"/>
+        <w:ind w:left="0"/>
         <w:rPr>
           <w:rFonts w:ascii="Times New Roman" w:hAnsi="Times New Roman" w:cs="Times New Roman"/>
           <w:color w:val="FF0000"/>
@@ -5026,9 +5225,10 @@
         <w:pStyle w:val="ListParagraph"/>
         <w:numPr>
           <w:ilvl w:val="0"/>
-          <w:numId w:val="1"/>
+          <w:numId w:val="11"/>
         </w:numPr>
         <w:spacing w:before="100" w:beforeAutospacing="1" w:after="100" w:afterAutospacing="1" w:line="240" w:lineRule="auto"/>
+        <w:ind w:left="1080"/>
         <w:rPr>
           <w:rFonts w:ascii="Times New Roman" w:eastAsia="Times New Roman" w:hAnsi="Times New Roman" w:cs="Times New Roman"/>
           <w:kern w:val="0"/>
@@ -5052,7 +5252,11 @@
           <w:ilvl w:val="0"/>
           <w:numId w:val="6"/>
         </w:numPr>
+        <w:tabs>
+          <w:tab w:val="num" w:pos="360"/>
+        </w:tabs>
         <w:spacing w:before="100" w:beforeAutospacing="1" w:after="100" w:afterAutospacing="1" w:line="240" w:lineRule="auto"/>
+        <w:ind w:left="1440"/>
         <w:rPr>
           <w:rFonts w:ascii="Times New Roman" w:eastAsia="Times New Roman" w:hAnsi="Times New Roman" w:cs="Times New Roman"/>
           <w:kern w:val="0"/>
@@ -5069,6 +5273,28 @@
         </w:rPr>
         <w:t>What problems might arise in analyzing the data this way?</w:t>
       </w:r>
+    </w:p>
+    <w:p>
+      <w:pPr>
+        <w:spacing w:before="100" w:beforeAutospacing="1" w:after="100" w:afterAutospacing="1" w:line="240" w:lineRule="auto"/>
+        <w:rPr>
+          <w:rFonts w:ascii="Times New Roman" w:eastAsia="Times New Roman" w:hAnsi="Times New Roman" w:cs="Times New Roman"/>
+          <w:kern w:val="0"/>
+          <w:sz w:val="24"/>
+          <w:szCs w:val="24"/>
+        </w:rPr>
+      </w:pPr>
+    </w:p>
+    <w:p>
+      <w:pPr>
+        <w:spacing w:before="100" w:beforeAutospacing="1" w:after="100" w:afterAutospacing="1" w:line="240" w:lineRule="auto"/>
+        <w:rPr>
+          <w:rFonts w:ascii="Times New Roman" w:eastAsia="Times New Roman" w:hAnsi="Times New Roman" w:cs="Times New Roman"/>
+          <w:kern w:val="0"/>
+          <w:sz w:val="24"/>
+          <w:szCs w:val="24"/>
+        </w:rPr>
+      </w:pPr>
     </w:p>
     <w:p>
       <w:pPr>
@@ -5076,7 +5302,11 @@
           <w:ilvl w:val="0"/>
           <w:numId w:val="6"/>
         </w:numPr>
+        <w:tabs>
+          <w:tab w:val="num" w:pos="360"/>
+        </w:tabs>
         <w:spacing w:before="100" w:beforeAutospacing="1" w:after="100" w:afterAutospacing="1" w:line="240" w:lineRule="auto"/>
+        <w:ind w:left="1440"/>
         <w:rPr>
           <w:rFonts w:ascii="Times New Roman" w:eastAsia="Times New Roman" w:hAnsi="Times New Roman" w:cs="Times New Roman"/>
           <w:kern w:val="0"/>
@@ -5097,6 +5327,7 @@
     <w:p>
       <w:pPr>
         <w:pStyle w:val="ListParagraph"/>
+        <w:ind w:left="0"/>
         <w:rPr>
           <w:rFonts w:ascii="Times New Roman" w:hAnsi="Times New Roman" w:cs="Times New Roman"/>
           <w:sz w:val="24"/>
@@ -5105,10 +5336,334 @@
         </w:rPr>
       </w:pPr>
     </w:p>
-    <w:p/>
+    <w:p>
+      <w:pPr>
+        <w:pStyle w:val="ListParagraph"/>
+        <w:ind w:left="0"/>
+        <w:rPr>
+          <w:rFonts w:ascii="Times New Roman" w:hAnsi="Times New Roman" w:cs="Times New Roman"/>
+          <w:sz w:val="24"/>
+          <w:szCs w:val="24"/>
+          <w:shd w:val="clear" w:color="auto" w:fill="FFFFFF"/>
+        </w:rPr>
+      </w:pPr>
+    </w:p>
+    <w:p>
+      <w:pPr>
+        <w:pStyle w:val="ListParagraph"/>
+        <w:ind w:left="0"/>
+        <w:rPr>
+          <w:rFonts w:ascii="Times New Roman" w:hAnsi="Times New Roman" w:cs="Times New Roman"/>
+          <w:sz w:val="24"/>
+          <w:szCs w:val="24"/>
+          <w:shd w:val="clear" w:color="auto" w:fill="FFFFFF"/>
+        </w:rPr>
+      </w:pPr>
+    </w:p>
+    <w:p>
+      <w:pPr>
+        <w:pStyle w:val="ListParagraph"/>
+        <w:ind w:left="0"/>
+        <w:rPr>
+          <w:rFonts w:ascii="Times New Roman" w:hAnsi="Times New Roman" w:cs="Times New Roman"/>
+          <w:sz w:val="24"/>
+          <w:szCs w:val="24"/>
+          <w:shd w:val="clear" w:color="auto" w:fill="FFFFFF"/>
+        </w:rPr>
+      </w:pPr>
+    </w:p>
+    <w:p>
+      <w:pPr>
+        <w:pStyle w:val="ListParagraph"/>
+        <w:ind w:left="0"/>
+        <w:rPr>
+          <w:rFonts w:ascii="Times New Roman" w:hAnsi="Times New Roman" w:cs="Times New Roman"/>
+          <w:sz w:val="24"/>
+          <w:szCs w:val="24"/>
+          <w:shd w:val="clear" w:color="auto" w:fill="FFFFFF"/>
+        </w:rPr>
+      </w:pPr>
+    </w:p>
+    <w:p>
+      <w:pPr>
+        <w:pStyle w:val="ListParagraph"/>
+        <w:ind w:left="0"/>
+        <w:rPr>
+          <w:rFonts w:ascii="Times New Roman" w:hAnsi="Times New Roman" w:cs="Times New Roman"/>
+          <w:sz w:val="24"/>
+          <w:szCs w:val="24"/>
+          <w:shd w:val="clear" w:color="auto" w:fill="FFFFFF"/>
+        </w:rPr>
+      </w:pPr>
+    </w:p>
+    <w:p>
+      <w:pPr>
+        <w:pStyle w:val="ListParagraph"/>
+        <w:numPr>
+          <w:ilvl w:val="0"/>
+          <w:numId w:val="11"/>
+        </w:numPr>
+        <w:spacing w:before="100" w:beforeAutospacing="1" w:after="100" w:afterAutospacing="1" w:line="240" w:lineRule="auto"/>
+        <w:ind w:left="1080"/>
+        <w:rPr>
+          <w:rFonts w:ascii="Times New Roman" w:eastAsia="Times New Roman" w:hAnsi="Times New Roman" w:cs="Times New Roman"/>
+          <w:kern w:val="0"/>
+          <w:sz w:val="24"/>
+          <w:szCs w:val="24"/>
+          <w14:ligatures w14:val="none"/>
+        </w:rPr>
+      </w:pPr>
+      <w:r>
+        <w:rPr>
+          <w:rFonts w:ascii="Times New Roman" w:eastAsia="Times New Roman" w:hAnsi="Times New Roman" w:cs="Times New Roman"/>
+          <w:kern w:val="0"/>
+          <w:sz w:val="24"/>
+          <w:szCs w:val="24"/>
+          <w14:ligatures w14:val="none"/>
+        </w:rPr>
+        <w:t xml:space="preserve">(Optional) </w:t>
+      </w:r>
+      <w:r>
+        <w:rPr>
+          <w:rFonts w:ascii="Times New Roman" w:eastAsia="Times New Roman" w:hAnsi="Times New Roman" w:cs="Times New Roman"/>
+          <w:kern w:val="0"/>
+          <w:sz w:val="24"/>
+          <w:szCs w:val="24"/>
+          <w14:ligatures w14:val="none"/>
+        </w:rPr>
+        <w:t>Over the decades, women’s 100m swim times have improved substantially. Consider factors such as:</w:t>
+      </w:r>
+    </w:p>
+    <w:p>
+      <w:pPr>
+        <w:numPr>
+          <w:ilvl w:val="0"/>
+          <w:numId w:val="6"/>
+        </w:numPr>
+        <w:tabs>
+          <w:tab w:val="num" w:pos="360"/>
+        </w:tabs>
+        <w:spacing w:before="100" w:beforeAutospacing="1" w:after="100" w:afterAutospacing="1" w:line="240" w:lineRule="auto"/>
+        <w:ind w:left="1440"/>
+        <w:rPr>
+          <w:rFonts w:ascii="Times New Roman" w:eastAsia="Times New Roman" w:hAnsi="Times New Roman" w:cs="Times New Roman"/>
+          <w:kern w:val="0"/>
+          <w:sz w:val="24"/>
+          <w:szCs w:val="24"/>
+        </w:rPr>
+      </w:pPr>
+      <w:r>
+        <w:rPr>
+          <w:rFonts w:ascii="Times New Roman" w:eastAsia="Times New Roman" w:hAnsi="Times New Roman" w:cs="Times New Roman"/>
+          <w:kern w:val="0"/>
+          <w:sz w:val="24"/>
+          <w:szCs w:val="24"/>
+          <w14:ligatures w14:val="none"/>
+        </w:rPr>
+        <w:t>Advances in training and sports science</w:t>
+      </w:r>
+    </w:p>
+    <w:p>
+      <w:pPr>
+        <w:numPr>
+          <w:ilvl w:val="0"/>
+          <w:numId w:val="6"/>
+        </w:numPr>
+        <w:tabs>
+          <w:tab w:val="num" w:pos="360"/>
+        </w:tabs>
+        <w:spacing w:before="100" w:beforeAutospacing="1" w:after="100" w:afterAutospacing="1" w:line="240" w:lineRule="auto"/>
+        <w:ind w:left="1440"/>
+        <w:rPr>
+          <w:rFonts w:ascii="Times New Roman" w:eastAsia="Times New Roman" w:hAnsi="Times New Roman" w:cs="Times New Roman"/>
+          <w:kern w:val="0"/>
+          <w:sz w:val="24"/>
+          <w:szCs w:val="24"/>
+        </w:rPr>
+      </w:pPr>
+      <w:r>
+        <w:rPr>
+          <w:rFonts w:ascii="Times New Roman" w:eastAsia="Times New Roman" w:hAnsi="Times New Roman" w:cs="Times New Roman"/>
+          <w:kern w:val="0"/>
+          <w:sz w:val="24"/>
+          <w:szCs w:val="24"/>
+          <w14:ligatures w14:val="none"/>
+        </w:rPr>
+        <w:t>Changes in swimming rules (e.g., underwater limits)</w:t>
+      </w:r>
+    </w:p>
+    <w:p>
+      <w:pPr>
+        <w:numPr>
+          <w:ilvl w:val="0"/>
+          <w:numId w:val="6"/>
+        </w:numPr>
+        <w:tabs>
+          <w:tab w:val="num" w:pos="360"/>
+        </w:tabs>
+        <w:spacing w:before="100" w:beforeAutospacing="1" w:after="100" w:afterAutospacing="1" w:line="240" w:lineRule="auto"/>
+        <w:ind w:left="1440"/>
+        <w:rPr>
+          <w:rFonts w:ascii="Times New Roman" w:eastAsia="Times New Roman" w:hAnsi="Times New Roman" w:cs="Times New Roman"/>
+          <w:kern w:val="0"/>
+          <w:sz w:val="24"/>
+          <w:szCs w:val="24"/>
+        </w:rPr>
+      </w:pPr>
+      <w:r>
+        <w:rPr>
+          <w:rFonts w:ascii="Times New Roman" w:eastAsia="Times New Roman" w:hAnsi="Times New Roman" w:cs="Times New Roman"/>
+          <w:kern w:val="0"/>
+          <w:sz w:val="24"/>
+          <w:szCs w:val="24"/>
+          <w14:ligatures w14:val="none"/>
+        </w:rPr>
+        <w:t>Technology (swimsuits, pool design)</w:t>
+      </w:r>
+    </w:p>
+    <w:p>
+      <w:pPr>
+        <w:numPr>
+          <w:ilvl w:val="0"/>
+          <w:numId w:val="6"/>
+        </w:numPr>
+        <w:tabs>
+          <w:tab w:val="num" w:pos="360"/>
+        </w:tabs>
+        <w:spacing w:before="100" w:beforeAutospacing="1" w:after="100" w:afterAutospacing="1" w:line="240" w:lineRule="auto"/>
+        <w:ind w:left="1440"/>
+        <w:rPr>
+          <w:rFonts w:ascii="Times New Roman" w:eastAsia="Times New Roman" w:hAnsi="Times New Roman" w:cs="Times New Roman"/>
+          <w:kern w:val="0"/>
+          <w:sz w:val="24"/>
+          <w:szCs w:val="24"/>
+        </w:rPr>
+      </w:pPr>
+      <w:r>
+        <w:rPr>
+          <w:rFonts w:ascii="Times New Roman" w:eastAsia="Times New Roman" w:hAnsi="Times New Roman" w:cs="Times New Roman"/>
+          <w:kern w:val="0"/>
+          <w:sz w:val="24"/>
+          <w:szCs w:val="24"/>
+          <w14:ligatures w14:val="none"/>
+        </w:rPr>
+        <w:t>Growth in women’s participation and support for elite athletes</w:t>
+      </w:r>
+    </w:p>
+    <w:p>
+      <w:pPr>
+        <w:spacing w:before="100" w:beforeAutospacing="1" w:after="100" w:afterAutospacing="1" w:line="240" w:lineRule="auto"/>
+        <w:ind w:firstLine="1080"/>
+        <w:rPr>
+          <w:rFonts w:ascii="Times New Roman" w:eastAsia="Times New Roman" w:hAnsi="Times New Roman" w:cs="Times New Roman"/>
+          <w:kern w:val="0"/>
+          <w:sz w:val="24"/>
+          <w:szCs w:val="24"/>
+          <w14:ligatures w14:val="none"/>
+        </w:rPr>
+      </w:pPr>
+      <w:proofErr w:type="gramStart"/>
+      <w:r>
+        <w:rPr>
+          <w:rFonts w:ascii="Times New Roman" w:eastAsia="Times New Roman" w:hAnsi="Times New Roman" w:cs="Times New Roman"/>
+          <w:kern w:val="0"/>
+          <w:sz w:val="24"/>
+          <w:szCs w:val="24"/>
+          <w14:ligatures w14:val="none"/>
+        </w:rPr>
+        <w:t>Brainstorm</w:t>
+      </w:r>
+      <w:proofErr w:type="gramEnd"/>
+      <w:r>
+        <w:rPr>
+          <w:rFonts w:ascii="Times New Roman" w:eastAsia="Times New Roman" w:hAnsi="Times New Roman" w:cs="Times New Roman"/>
+          <w:kern w:val="0"/>
+          <w:sz w:val="24"/>
+          <w:szCs w:val="24"/>
+          <w14:ligatures w14:val="none"/>
+        </w:rPr>
+        <w:t xml:space="preserve"> some possible </w:t>
+      </w:r>
+      <w:proofErr w:type="gramStart"/>
+      <w:r>
+        <w:rPr>
+          <w:rFonts w:ascii="Times New Roman" w:eastAsia="Times New Roman" w:hAnsi="Times New Roman" w:cs="Times New Roman"/>
+          <w:kern w:val="0"/>
+          <w:sz w:val="24"/>
+          <w:szCs w:val="24"/>
+          <w14:ligatures w14:val="none"/>
+        </w:rPr>
+        <w:t>reasons</w:t>
+      </w:r>
+      <w:proofErr w:type="gramEnd"/>
+      <w:r>
+        <w:rPr>
+          <w:rFonts w:ascii="Times New Roman" w:eastAsia="Times New Roman" w:hAnsi="Times New Roman" w:cs="Times New Roman"/>
+          <w:kern w:val="0"/>
+          <w:sz w:val="24"/>
+          <w:szCs w:val="24"/>
+          <w14:ligatures w14:val="none"/>
+        </w:rPr>
+        <w:t xml:space="preserve"> </w:t>
+      </w:r>
+      <w:r>
+        <w:rPr>
+          <w:rFonts w:ascii="Times New Roman" w:eastAsia="Times New Roman" w:hAnsi="Times New Roman" w:cs="Times New Roman"/>
+          <w:kern w:val="0"/>
+          <w:sz w:val="24"/>
+          <w:szCs w:val="24"/>
+          <w14:ligatures w14:val="none"/>
+        </w:rPr>
+        <w:t xml:space="preserve">how these </w:t>
+      </w:r>
+      <w:proofErr w:type="gramStart"/>
+      <w:r>
+        <w:rPr>
+          <w:rFonts w:ascii="Times New Roman" w:eastAsia="Times New Roman" w:hAnsi="Times New Roman" w:cs="Times New Roman"/>
+          <w:kern w:val="0"/>
+          <w:sz w:val="24"/>
+          <w:szCs w:val="24"/>
+          <w14:ligatures w14:val="none"/>
+        </w:rPr>
+        <w:t>changes make</w:t>
+      </w:r>
+      <w:proofErr w:type="gramEnd"/>
+      <w:r>
+        <w:rPr>
+          <w:rFonts w:ascii="Times New Roman" w:eastAsia="Times New Roman" w:hAnsi="Times New Roman" w:cs="Times New Roman"/>
+          <w:kern w:val="0"/>
+          <w:sz w:val="24"/>
+          <w:szCs w:val="24"/>
+          <w14:ligatures w14:val="none"/>
+        </w:rPr>
+        <w:t xml:space="preserve"> have impacted </w:t>
+      </w:r>
+      <w:proofErr w:type="gramStart"/>
+      <w:r>
+        <w:rPr>
+          <w:rFonts w:ascii="Times New Roman" w:eastAsia="Times New Roman" w:hAnsi="Times New Roman" w:cs="Times New Roman"/>
+          <w:kern w:val="0"/>
+          <w:sz w:val="24"/>
+          <w:szCs w:val="24"/>
+          <w14:ligatures w14:val="none"/>
+        </w:rPr>
+        <w:t>swim</w:t>
+      </w:r>
+      <w:proofErr w:type="gramEnd"/>
+      <w:r>
+        <w:rPr>
+          <w:rFonts w:ascii="Times New Roman" w:eastAsia="Times New Roman" w:hAnsi="Times New Roman" w:cs="Times New Roman"/>
+          <w:kern w:val="0"/>
+          <w:sz w:val="24"/>
+          <w:szCs w:val="24"/>
+          <w14:ligatures w14:val="none"/>
+        </w:rPr>
+        <w:t xml:space="preserve"> times.</w:t>
+      </w:r>
+    </w:p>
     <w:sectPr>
       <w:pgSz w:w="12240" w:h="15840"/>
-      <w:pgMar w:top="1440" w:right="1440" w:bottom="1440" w:left="1440" w:header="720" w:footer="720" w:gutter="0"/>
+      <w:pgMar w:top="1440" w:right="1080" w:bottom="1440" w:left="1080" w:header="720" w:footer="720" w:gutter="0"/>
       <w:cols w:space="720"/>
       <w:docGrid w:linePitch="360"/>
     </w:sectPr>
@@ -5117,7 +5672,7 @@
 </file>
 
 <file path=word/numbering.xml><?xml version="1.0" encoding="utf-8"?>
-<w:numbering xmlns:wpc="http://schemas.microsoft.com/office/word/2010/wordprocessingCanvas" xmlns:cx="http://schemas.microsoft.com/office/drawing/2014/chartex" xmlns:cx1="http://schemas.microsoft.com/office/drawing/2015/9/8/chartex" xmlns:mc="http://schemas.openxmlformats.org/markup-compatibility/2006" xmlns:o="urn:schemas-microsoft-com:office:office" xmlns:r="http://schemas.openxmlformats.org/officeDocument/2006/relationships" xmlns:m="http://schemas.openxmlformats.org/officeDocument/2006/math" xmlns:v="urn:schemas-microsoft-com:vml" xmlns:wp14="http://schemas.microsoft.com/office/word/2010/wordprocessingDrawing" xmlns:wp="http://schemas.openxmlformats.org/drawingml/2006/wordprocessingDrawing" xmlns:w10="urn:schemas-microsoft-com:office:word" xmlns:w="http://schemas.openxmlformats.org/wordprocessingml/2006/main" xmlns:w14="http://schemas.microsoft.com/office/word/2010/wordml" xmlns:w15="http://schemas.microsoft.com/office/word/2012/wordml" xmlns:w16se="http://schemas.microsoft.com/office/word/2015/wordml/symex" xmlns:wpg="http://schemas.microsoft.com/office/word/2010/wordprocessingGroup" xmlns:wpi="http://schemas.microsoft.com/office/word/2010/wordprocessingInk" xmlns:wne="http://schemas.microsoft.com/office/word/2006/wordml" xmlns:wps="http://schemas.microsoft.com/office/word/2010/wordprocessingShape" mc:Ignorable="w14 w15 w16se wp14">
+<w:numbering xmlns:wpc="http://schemas.microsoft.com/office/word/2010/wordprocessingCanvas" xmlns:cx="http://schemas.microsoft.com/office/drawing/2014/chartex" xmlns:cx1="http://schemas.microsoft.com/office/drawing/2015/9/8/chartex" xmlns:cx2="http://schemas.microsoft.com/office/drawing/2015/10/21/chartex" xmlns:cx3="http://schemas.microsoft.com/office/drawing/2016/5/9/chartex" xmlns:cx4="http://schemas.microsoft.com/office/drawing/2016/5/10/chartex" xmlns:cx5="http://schemas.microsoft.com/office/drawing/2016/5/11/chartex" xmlns:cx6="http://schemas.microsoft.com/office/drawing/2016/5/12/chartex" xmlns:cx7="http://schemas.microsoft.com/office/drawing/2016/5/13/chartex" xmlns:cx8="http://schemas.microsoft.com/office/drawing/2016/5/14/chartex" xmlns:mc="http://schemas.openxmlformats.org/markup-compatibility/2006" xmlns:aink="http://schemas.microsoft.com/office/drawing/2016/ink" xmlns:am3d="http://schemas.microsoft.com/office/drawing/2017/model3d" xmlns:o="urn:schemas-microsoft-com:office:office" xmlns:oel="http://schemas.microsoft.com/office/2019/extlst" xmlns:r="http://schemas.openxmlformats.org/officeDocument/2006/relationships" xmlns:m="http://schemas.openxmlformats.org/officeDocument/2006/math" xmlns:v="urn:schemas-microsoft-com:vml" xmlns:wp14="http://schemas.microsoft.com/office/word/2010/wordprocessingDrawing" xmlns:wp="http://schemas.openxmlformats.org/drawingml/2006/wordprocessingDrawing" xmlns:w10="urn:schemas-microsoft-com:office:word" xmlns:w="http://schemas.openxmlformats.org/wordprocessingml/2006/main" xmlns:w14="http://schemas.microsoft.com/office/word/2010/wordml" xmlns:w15="http://schemas.microsoft.com/office/word/2012/wordml" xmlns:w16cex="http://schemas.microsoft.com/office/word/2018/wordml/cex" xmlns:w16cid="http://schemas.microsoft.com/office/word/2016/wordml/cid" xmlns:w16="http://schemas.microsoft.com/office/word/2018/wordml" xmlns:w16du="http://schemas.microsoft.com/office/word/2023/wordml/word16du" xmlns:w16sdtdh="http://schemas.microsoft.com/office/word/2020/wordml/sdtdatahash" xmlns:w16sdtfl="http://schemas.microsoft.com/office/word/2024/wordml/sdtformatlock" xmlns:w16se="http://schemas.microsoft.com/office/word/2015/wordml/symex" xmlns:wpg="http://schemas.microsoft.com/office/word/2010/wordprocessingGroup" xmlns:wpi="http://schemas.microsoft.com/office/word/2010/wordprocessingInk" xmlns:wne="http://schemas.microsoft.com/office/word/2006/wordml" xmlns:wps="http://schemas.microsoft.com/office/word/2010/wordprocessingShape" mc:Ignorable="w14 w15 w16se w16cid w16 w16cex w16sdtdh w16sdtfl w16du wp14">
   <w:abstractNum w:abstractNumId="0" w15:restartNumberingAfterBreak="0">
     <w:nsid w:val="199520CD"/>
     <w:multiLevelType w:val="multilevel"/>
@@ -5129,9 +5684,9 @@
       <w:lvlJc w:val="left"/>
       <w:pPr>
         <w:tabs>
-          <w:tab w:val="num" w:pos="720"/>
+          <w:tab w:val="num" w:pos="1800"/>
         </w:tabs>
-        <w:ind w:left="720" w:hanging="360"/>
+        <w:ind w:left="1800" w:hanging="360"/>
       </w:pPr>
       <w:rPr>
         <w:rFonts w:ascii="Symbol" w:hAnsi="Symbol" w:hint="default"/>
@@ -5145,9 +5700,9 @@
       <w:lvlJc w:val="left"/>
       <w:pPr>
         <w:tabs>
-          <w:tab w:val="num" w:pos="1440"/>
+          <w:tab w:val="num" w:pos="2520"/>
         </w:tabs>
-        <w:ind w:left="1440" w:hanging="360"/>
+        <w:ind w:left="2520" w:hanging="360"/>
       </w:pPr>
       <w:rPr>
         <w:rFonts w:ascii="Courier New" w:hAnsi="Courier New" w:hint="default"/>
@@ -5161,9 +5716,9 @@
       <w:lvlJc w:val="left"/>
       <w:pPr>
         <w:tabs>
-          <w:tab w:val="num" w:pos="2160"/>
+          <w:tab w:val="num" w:pos="3240"/>
         </w:tabs>
-        <w:ind w:left="2160" w:hanging="360"/>
+        <w:ind w:left="3240" w:hanging="360"/>
       </w:pPr>
       <w:rPr>
         <w:rFonts w:ascii="Wingdings" w:hAnsi="Wingdings" w:hint="default"/>
@@ -5177,9 +5732,9 @@
       <w:lvlJc w:val="left"/>
       <w:pPr>
         <w:tabs>
-          <w:tab w:val="num" w:pos="2880"/>
+          <w:tab w:val="num" w:pos="3960"/>
         </w:tabs>
-        <w:ind w:left="2880" w:hanging="360"/>
+        <w:ind w:left="3960" w:hanging="360"/>
       </w:pPr>
       <w:rPr>
         <w:rFonts w:ascii="Wingdings" w:hAnsi="Wingdings" w:hint="default"/>
@@ -5193,9 +5748,9 @@
       <w:lvlJc w:val="left"/>
       <w:pPr>
         <w:tabs>
-          <w:tab w:val="num" w:pos="3600"/>
+          <w:tab w:val="num" w:pos="4680"/>
         </w:tabs>
-        <w:ind w:left="3600" w:hanging="360"/>
+        <w:ind w:left="4680" w:hanging="360"/>
       </w:pPr>
       <w:rPr>
         <w:rFonts w:ascii="Wingdings" w:hAnsi="Wingdings" w:hint="default"/>
@@ -5209,9 +5764,9 @@
       <w:lvlJc w:val="left"/>
       <w:pPr>
         <w:tabs>
-          <w:tab w:val="num" w:pos="4320"/>
+          <w:tab w:val="num" w:pos="5400"/>
         </w:tabs>
-        <w:ind w:left="4320" w:hanging="360"/>
+        <w:ind w:left="5400" w:hanging="360"/>
       </w:pPr>
       <w:rPr>
         <w:rFonts w:ascii="Wingdings" w:hAnsi="Wingdings" w:hint="default"/>
@@ -5225,9 +5780,9 @@
       <w:lvlJc w:val="left"/>
       <w:pPr>
         <w:tabs>
-          <w:tab w:val="num" w:pos="5040"/>
+          <w:tab w:val="num" w:pos="6120"/>
         </w:tabs>
-        <w:ind w:left="5040" w:hanging="360"/>
+        <w:ind w:left="6120" w:hanging="360"/>
       </w:pPr>
       <w:rPr>
         <w:rFonts w:ascii="Wingdings" w:hAnsi="Wingdings" w:hint="default"/>
@@ -5241,9 +5796,9 @@
       <w:lvlJc w:val="left"/>
       <w:pPr>
         <w:tabs>
-          <w:tab w:val="num" w:pos="5760"/>
+          <w:tab w:val="num" w:pos="6840"/>
         </w:tabs>
-        <w:ind w:left="5760" w:hanging="360"/>
+        <w:ind w:left="6840" w:hanging="360"/>
       </w:pPr>
       <w:rPr>
         <w:rFonts w:ascii="Wingdings" w:hAnsi="Wingdings" w:hint="default"/>
@@ -5257,9 +5812,9 @@
       <w:lvlJc w:val="left"/>
       <w:pPr>
         <w:tabs>
-          <w:tab w:val="num" w:pos="6480"/>
+          <w:tab w:val="num" w:pos="7560"/>
         </w:tabs>
-        <w:ind w:left="6480" w:hanging="360"/>
+        <w:ind w:left="7560" w:hanging="360"/>
       </w:pPr>
       <w:rPr>
         <w:rFonts w:ascii="Wingdings" w:hAnsi="Wingdings" w:hint="default"/>
@@ -5268,6 +5823,95 @@
     </w:lvl>
   </w:abstractNum>
   <w:abstractNum w:abstractNumId="1" w15:restartNumberingAfterBreak="0">
+    <w:nsid w:val="214C280C"/>
+    <w:multiLevelType w:val="hybridMultilevel"/>
+    <w:tmpl w:val="1D024CA2"/>
+    <w:lvl w:ilvl="0" w:tplc="85BE29EE">
+      <w:start w:val="1"/>
+      <w:numFmt w:val="lowerLetter"/>
+      <w:lvlText w:val="%1."/>
+      <w:lvlJc w:val="left"/>
+      <w:pPr>
+        <w:ind w:left="2160" w:hanging="360"/>
+      </w:pPr>
+      <w:rPr>
+        <w:rFonts w:hint="default"/>
+      </w:rPr>
+    </w:lvl>
+    <w:lvl w:ilvl="1" w:tplc="04090019" w:tentative="1">
+      <w:start w:val="1"/>
+      <w:numFmt w:val="lowerLetter"/>
+      <w:lvlText w:val="%2."/>
+      <w:lvlJc w:val="left"/>
+      <w:pPr>
+        <w:ind w:left="2880" w:hanging="360"/>
+      </w:pPr>
+    </w:lvl>
+    <w:lvl w:ilvl="2" w:tplc="0409001B" w:tentative="1">
+      <w:start w:val="1"/>
+      <w:numFmt w:val="lowerRoman"/>
+      <w:lvlText w:val="%3."/>
+      <w:lvlJc w:val="right"/>
+      <w:pPr>
+        <w:ind w:left="3600" w:hanging="180"/>
+      </w:pPr>
+    </w:lvl>
+    <w:lvl w:ilvl="3" w:tplc="0409000F" w:tentative="1">
+      <w:start w:val="1"/>
+      <w:numFmt w:val="decimal"/>
+      <w:lvlText w:val="%4."/>
+      <w:lvlJc w:val="left"/>
+      <w:pPr>
+        <w:ind w:left="4320" w:hanging="360"/>
+      </w:pPr>
+    </w:lvl>
+    <w:lvl w:ilvl="4" w:tplc="04090019" w:tentative="1">
+      <w:start w:val="1"/>
+      <w:numFmt w:val="lowerLetter"/>
+      <w:lvlText w:val="%5."/>
+      <w:lvlJc w:val="left"/>
+      <w:pPr>
+        <w:ind w:left="5040" w:hanging="360"/>
+      </w:pPr>
+    </w:lvl>
+    <w:lvl w:ilvl="5" w:tplc="0409001B" w:tentative="1">
+      <w:start w:val="1"/>
+      <w:numFmt w:val="lowerRoman"/>
+      <w:lvlText w:val="%6."/>
+      <w:lvlJc w:val="right"/>
+      <w:pPr>
+        <w:ind w:left="5760" w:hanging="180"/>
+      </w:pPr>
+    </w:lvl>
+    <w:lvl w:ilvl="6" w:tplc="0409000F" w:tentative="1">
+      <w:start w:val="1"/>
+      <w:numFmt w:val="decimal"/>
+      <w:lvlText w:val="%7."/>
+      <w:lvlJc w:val="left"/>
+      <w:pPr>
+        <w:ind w:left="6480" w:hanging="360"/>
+      </w:pPr>
+    </w:lvl>
+    <w:lvl w:ilvl="7" w:tplc="04090019" w:tentative="1">
+      <w:start w:val="1"/>
+      <w:numFmt w:val="lowerLetter"/>
+      <w:lvlText w:val="%8."/>
+      <w:lvlJc w:val="left"/>
+      <w:pPr>
+        <w:ind w:left="7200" w:hanging="360"/>
+      </w:pPr>
+    </w:lvl>
+    <w:lvl w:ilvl="8" w:tplc="0409001B" w:tentative="1">
+      <w:start w:val="1"/>
+      <w:numFmt w:val="lowerRoman"/>
+      <w:lvlText w:val="%9."/>
+      <w:lvlJc w:val="right"/>
+      <w:pPr>
+        <w:ind w:left="7920" w:hanging="180"/>
+      </w:pPr>
+    </w:lvl>
+  </w:abstractNum>
+  <w:abstractNum w:abstractNumId="2" w15:restartNumberingAfterBreak="0">
     <w:nsid w:val="29F54D28"/>
     <w:multiLevelType w:val="hybridMultilevel"/>
     <w:tmpl w:val="03B45E4A"/>
@@ -5356,7 +6000,7 @@
       </w:pPr>
     </w:lvl>
   </w:abstractNum>
-  <w:abstractNum w:abstractNumId="2" w15:restartNumberingAfterBreak="0">
+  <w:abstractNum w:abstractNumId="3" w15:restartNumberingAfterBreak="0">
     <w:nsid w:val="3C2355D7"/>
     <w:multiLevelType w:val="multilevel"/>
     <w:tmpl w:val="BFD85CCA"/>
@@ -5367,9 +6011,9 @@
       <w:lvlJc w:val="left"/>
       <w:pPr>
         <w:tabs>
-          <w:tab w:val="num" w:pos="1080"/>
+          <w:tab w:val="num" w:pos="2520"/>
         </w:tabs>
-        <w:ind w:left="1080" w:hanging="360"/>
+        <w:ind w:left="2520" w:hanging="360"/>
       </w:pPr>
       <w:rPr>
         <w:rFonts w:ascii="Symbol" w:hAnsi="Symbol" w:hint="default"/>
@@ -5383,9 +6027,9 @@
       <w:lvlJc w:val="left"/>
       <w:pPr>
         <w:tabs>
-          <w:tab w:val="num" w:pos="1800"/>
+          <w:tab w:val="num" w:pos="3240"/>
         </w:tabs>
-        <w:ind w:left="1800" w:hanging="360"/>
+        <w:ind w:left="3240" w:hanging="360"/>
       </w:pPr>
       <w:rPr>
         <w:rFonts w:ascii="Courier New" w:hAnsi="Courier New" w:hint="default"/>
@@ -5399,9 +6043,9 @@
       <w:lvlJc w:val="left"/>
       <w:pPr>
         <w:tabs>
-          <w:tab w:val="num" w:pos="2520"/>
+          <w:tab w:val="num" w:pos="3960"/>
         </w:tabs>
-        <w:ind w:left="2520" w:hanging="360"/>
+        <w:ind w:left="3960" w:hanging="360"/>
       </w:pPr>
       <w:rPr>
         <w:rFonts w:ascii="Wingdings" w:hAnsi="Wingdings" w:hint="default"/>
@@ -5415,9 +6059,9 @@
       <w:lvlJc w:val="left"/>
       <w:pPr>
         <w:tabs>
-          <w:tab w:val="num" w:pos="3240"/>
+          <w:tab w:val="num" w:pos="4680"/>
         </w:tabs>
-        <w:ind w:left="3240" w:hanging="360"/>
+        <w:ind w:left="4680" w:hanging="360"/>
       </w:pPr>
       <w:rPr>
         <w:rFonts w:ascii="Wingdings" w:hAnsi="Wingdings" w:hint="default"/>
@@ -5431,9 +6075,9 @@
       <w:lvlJc w:val="left"/>
       <w:pPr>
         <w:tabs>
-          <w:tab w:val="num" w:pos="3960"/>
+          <w:tab w:val="num" w:pos="5400"/>
         </w:tabs>
-        <w:ind w:left="3960" w:hanging="360"/>
+        <w:ind w:left="5400" w:hanging="360"/>
       </w:pPr>
       <w:rPr>
         <w:rFonts w:ascii="Wingdings" w:hAnsi="Wingdings" w:hint="default"/>
@@ -5447,9 +6091,9 @@
       <w:lvlJc w:val="left"/>
       <w:pPr>
         <w:tabs>
-          <w:tab w:val="num" w:pos="4680"/>
+          <w:tab w:val="num" w:pos="6120"/>
         </w:tabs>
-        <w:ind w:left="4680" w:hanging="360"/>
+        <w:ind w:left="6120" w:hanging="360"/>
       </w:pPr>
       <w:rPr>
         <w:rFonts w:ascii="Wingdings" w:hAnsi="Wingdings" w:hint="default"/>
@@ -5463,9 +6107,9 @@
       <w:lvlJc w:val="left"/>
       <w:pPr>
         <w:tabs>
-          <w:tab w:val="num" w:pos="5400"/>
+          <w:tab w:val="num" w:pos="6840"/>
         </w:tabs>
-        <w:ind w:left="5400" w:hanging="360"/>
+        <w:ind w:left="6840" w:hanging="360"/>
       </w:pPr>
       <w:rPr>
         <w:rFonts w:ascii="Wingdings" w:hAnsi="Wingdings" w:hint="default"/>
@@ -5479,9 +6123,9 @@
       <w:lvlJc w:val="left"/>
       <w:pPr>
         <w:tabs>
-          <w:tab w:val="num" w:pos="6120"/>
+          <w:tab w:val="num" w:pos="7560"/>
         </w:tabs>
-        <w:ind w:left="6120" w:hanging="360"/>
+        <w:ind w:left="7560" w:hanging="360"/>
       </w:pPr>
       <w:rPr>
         <w:rFonts w:ascii="Wingdings" w:hAnsi="Wingdings" w:hint="default"/>
@@ -5495,9 +6139,9 @@
       <w:lvlJc w:val="left"/>
       <w:pPr>
         <w:tabs>
-          <w:tab w:val="num" w:pos="6840"/>
+          <w:tab w:val="num" w:pos="8280"/>
         </w:tabs>
-        <w:ind w:left="6840" w:hanging="360"/>
+        <w:ind w:left="8280" w:hanging="360"/>
       </w:pPr>
       <w:rPr>
         <w:rFonts w:ascii="Wingdings" w:hAnsi="Wingdings" w:hint="default"/>
@@ -5505,7 +6149,156 @@
       </w:rPr>
     </w:lvl>
   </w:abstractNum>
-  <w:abstractNum w:abstractNumId="3" w15:restartNumberingAfterBreak="0">
+  <w:abstractNum w:abstractNumId="4" w15:restartNumberingAfterBreak="0">
+    <w:nsid w:val="433D3C13"/>
+    <w:multiLevelType w:val="multilevel"/>
+    <w:tmpl w:val="E80A6CCA"/>
+    <w:lvl w:ilvl="0">
+      <w:start w:val="1"/>
+      <w:numFmt w:val="bullet"/>
+      <w:lvlText w:val=""/>
+      <w:lvlJc w:val="left"/>
+      <w:pPr>
+        <w:tabs>
+          <w:tab w:val="num" w:pos="3960"/>
+        </w:tabs>
+        <w:ind w:left="3960" w:hanging="360"/>
+      </w:pPr>
+      <w:rPr>
+        <w:rFonts w:ascii="Symbol" w:hAnsi="Symbol" w:hint="default"/>
+        <w:sz w:val="20"/>
+      </w:rPr>
+    </w:lvl>
+    <w:lvl w:ilvl="1">
+      <w:start w:val="1"/>
+      <w:numFmt w:val="bullet"/>
+      <w:lvlText w:val="o"/>
+      <w:lvlJc w:val="left"/>
+      <w:pPr>
+        <w:tabs>
+          <w:tab w:val="num" w:pos="4680"/>
+        </w:tabs>
+        <w:ind w:left="4680" w:hanging="360"/>
+      </w:pPr>
+      <w:rPr>
+        <w:rFonts w:ascii="Courier New" w:hAnsi="Courier New" w:hint="default"/>
+        <w:sz w:val="20"/>
+      </w:rPr>
+    </w:lvl>
+    <w:lvl w:ilvl="2" w:tentative="1">
+      <w:start w:val="1"/>
+      <w:numFmt w:val="bullet"/>
+      <w:lvlText w:val=""/>
+      <w:lvlJc w:val="left"/>
+      <w:pPr>
+        <w:tabs>
+          <w:tab w:val="num" w:pos="5400"/>
+        </w:tabs>
+        <w:ind w:left="5400" w:hanging="360"/>
+      </w:pPr>
+      <w:rPr>
+        <w:rFonts w:ascii="Wingdings" w:hAnsi="Wingdings" w:hint="default"/>
+        <w:sz w:val="20"/>
+      </w:rPr>
+    </w:lvl>
+    <w:lvl w:ilvl="3" w:tentative="1">
+      <w:start w:val="1"/>
+      <w:numFmt w:val="bullet"/>
+      <w:lvlText w:val=""/>
+      <w:lvlJc w:val="left"/>
+      <w:pPr>
+        <w:tabs>
+          <w:tab w:val="num" w:pos="6120"/>
+        </w:tabs>
+        <w:ind w:left="6120" w:hanging="360"/>
+      </w:pPr>
+      <w:rPr>
+        <w:rFonts w:ascii="Wingdings" w:hAnsi="Wingdings" w:hint="default"/>
+        <w:sz w:val="20"/>
+      </w:rPr>
+    </w:lvl>
+    <w:lvl w:ilvl="4" w:tentative="1">
+      <w:start w:val="1"/>
+      <w:numFmt w:val="bullet"/>
+      <w:lvlText w:val=""/>
+      <w:lvlJc w:val="left"/>
+      <w:pPr>
+        <w:tabs>
+          <w:tab w:val="num" w:pos="6840"/>
+        </w:tabs>
+        <w:ind w:left="6840" w:hanging="360"/>
+      </w:pPr>
+      <w:rPr>
+        <w:rFonts w:ascii="Wingdings" w:hAnsi="Wingdings" w:hint="default"/>
+        <w:sz w:val="20"/>
+      </w:rPr>
+    </w:lvl>
+    <w:lvl w:ilvl="5" w:tentative="1">
+      <w:start w:val="1"/>
+      <w:numFmt w:val="bullet"/>
+      <w:lvlText w:val=""/>
+      <w:lvlJc w:val="left"/>
+      <w:pPr>
+        <w:tabs>
+          <w:tab w:val="num" w:pos="7560"/>
+        </w:tabs>
+        <w:ind w:left="7560" w:hanging="360"/>
+      </w:pPr>
+      <w:rPr>
+        <w:rFonts w:ascii="Wingdings" w:hAnsi="Wingdings" w:hint="default"/>
+        <w:sz w:val="20"/>
+      </w:rPr>
+    </w:lvl>
+    <w:lvl w:ilvl="6" w:tentative="1">
+      <w:start w:val="1"/>
+      <w:numFmt w:val="bullet"/>
+      <w:lvlText w:val=""/>
+      <w:lvlJc w:val="left"/>
+      <w:pPr>
+        <w:tabs>
+          <w:tab w:val="num" w:pos="8280"/>
+        </w:tabs>
+        <w:ind w:left="8280" w:hanging="360"/>
+      </w:pPr>
+      <w:rPr>
+        <w:rFonts w:ascii="Wingdings" w:hAnsi="Wingdings" w:hint="default"/>
+        <w:sz w:val="20"/>
+      </w:rPr>
+    </w:lvl>
+    <w:lvl w:ilvl="7" w:tentative="1">
+      <w:start w:val="1"/>
+      <w:numFmt w:val="bullet"/>
+      <w:lvlText w:val=""/>
+      <w:lvlJc w:val="left"/>
+      <w:pPr>
+        <w:tabs>
+          <w:tab w:val="num" w:pos="9000"/>
+        </w:tabs>
+        <w:ind w:left="9000" w:hanging="360"/>
+      </w:pPr>
+      <w:rPr>
+        <w:rFonts w:ascii="Wingdings" w:hAnsi="Wingdings" w:hint="default"/>
+        <w:sz w:val="20"/>
+      </w:rPr>
+    </w:lvl>
+    <w:lvl w:ilvl="8" w:tentative="1">
+      <w:start w:val="1"/>
+      <w:numFmt w:val="bullet"/>
+      <w:lvlText w:val=""/>
+      <w:lvlJc w:val="left"/>
+      <w:pPr>
+        <w:tabs>
+          <w:tab w:val="num" w:pos="9720"/>
+        </w:tabs>
+        <w:ind w:left="9720" w:hanging="360"/>
+      </w:pPr>
+      <w:rPr>
+        <w:rFonts w:ascii="Wingdings" w:hAnsi="Wingdings" w:hint="default"/>
+        <w:sz w:val="20"/>
+      </w:rPr>
+    </w:lvl>
+  </w:abstractNum>
+  <w:abstractNum w:abstractNumId="5" w15:restartNumberingAfterBreak="0">
     <w:nsid w:val="43931B5D"/>
     <w:multiLevelType w:val="hybridMultilevel"/>
     <w:tmpl w:val="F22E887A"/>
@@ -5533,7 +6326,7 @@
         <w:rFonts w:ascii="Symbol" w:hAnsi="Symbol" w:hint="default"/>
       </w:rPr>
     </w:lvl>
-    <w:lvl w:ilvl="2" w:tplc="0409001B" w:tentative="1">
+    <w:lvl w:ilvl="2" w:tplc="0409001B">
       <w:start w:val="1"/>
       <w:numFmt w:val="lowerRoman"/>
       <w:lvlText w:val="%3."/>
@@ -5597,7 +6390,7 @@
       </w:pPr>
     </w:lvl>
   </w:abstractNum>
-  <w:abstractNum w:abstractNumId="4" w15:restartNumberingAfterBreak="0">
+  <w:abstractNum w:abstractNumId="6" w15:restartNumberingAfterBreak="0">
     <w:nsid w:val="49A27F38"/>
     <w:multiLevelType w:val="multilevel"/>
     <w:tmpl w:val="CD9EDFFA"/>
@@ -5608,9 +6401,9 @@
       <w:lvlJc w:val="left"/>
       <w:pPr>
         <w:tabs>
-          <w:tab w:val="num" w:pos="1080"/>
+          <w:tab w:val="num" w:pos="2520"/>
         </w:tabs>
-        <w:ind w:left="1080" w:hanging="360"/>
+        <w:ind w:left="2520" w:hanging="360"/>
       </w:pPr>
       <w:rPr>
         <w:rFonts w:ascii="Symbol" w:hAnsi="Symbol" w:hint="default"/>
@@ -5624,9 +6417,9 @@
       <w:lvlJc w:val="left"/>
       <w:pPr>
         <w:tabs>
-          <w:tab w:val="num" w:pos="1800"/>
+          <w:tab w:val="num" w:pos="3240"/>
         </w:tabs>
-        <w:ind w:left="1800" w:hanging="360"/>
+        <w:ind w:left="3240" w:hanging="360"/>
       </w:pPr>
       <w:rPr>
         <w:rFonts w:ascii="Courier New" w:hAnsi="Courier New" w:hint="default"/>
@@ -5640,9 +6433,9 @@
       <w:lvlJc w:val="left"/>
       <w:pPr>
         <w:tabs>
-          <w:tab w:val="num" w:pos="2520"/>
+          <w:tab w:val="num" w:pos="3960"/>
         </w:tabs>
-        <w:ind w:left="2520" w:hanging="360"/>
+        <w:ind w:left="3960" w:hanging="360"/>
       </w:pPr>
       <w:rPr>
         <w:rFonts w:ascii="Wingdings" w:hAnsi="Wingdings" w:hint="default"/>
@@ -5656,9 +6449,9 @@
       <w:lvlJc w:val="left"/>
       <w:pPr>
         <w:tabs>
-          <w:tab w:val="num" w:pos="3240"/>
+          <w:tab w:val="num" w:pos="4680"/>
         </w:tabs>
-        <w:ind w:left="3240" w:hanging="360"/>
+        <w:ind w:left="4680" w:hanging="360"/>
       </w:pPr>
       <w:rPr>
         <w:rFonts w:ascii="Wingdings" w:hAnsi="Wingdings" w:hint="default"/>
@@ -5672,9 +6465,9 @@
       <w:lvlJc w:val="left"/>
       <w:pPr>
         <w:tabs>
-          <w:tab w:val="num" w:pos="3960"/>
+          <w:tab w:val="num" w:pos="5400"/>
         </w:tabs>
-        <w:ind w:left="3960" w:hanging="360"/>
+        <w:ind w:left="5400" w:hanging="360"/>
       </w:pPr>
       <w:rPr>
         <w:rFonts w:ascii="Wingdings" w:hAnsi="Wingdings" w:hint="default"/>
@@ -5688,9 +6481,9 @@
       <w:lvlJc w:val="left"/>
       <w:pPr>
         <w:tabs>
-          <w:tab w:val="num" w:pos="4680"/>
+          <w:tab w:val="num" w:pos="6120"/>
         </w:tabs>
-        <w:ind w:left="4680" w:hanging="360"/>
+        <w:ind w:left="6120" w:hanging="360"/>
       </w:pPr>
       <w:rPr>
         <w:rFonts w:ascii="Wingdings" w:hAnsi="Wingdings" w:hint="default"/>
@@ -5704,9 +6497,9 @@
       <w:lvlJc w:val="left"/>
       <w:pPr>
         <w:tabs>
-          <w:tab w:val="num" w:pos="5400"/>
+          <w:tab w:val="num" w:pos="6840"/>
         </w:tabs>
-        <w:ind w:left="5400" w:hanging="360"/>
+        <w:ind w:left="6840" w:hanging="360"/>
       </w:pPr>
       <w:rPr>
         <w:rFonts w:ascii="Wingdings" w:hAnsi="Wingdings" w:hint="default"/>
@@ -5720,9 +6513,9 @@
       <w:lvlJc w:val="left"/>
       <w:pPr>
         <w:tabs>
-          <w:tab w:val="num" w:pos="6120"/>
+          <w:tab w:val="num" w:pos="7560"/>
         </w:tabs>
-        <w:ind w:left="6120" w:hanging="360"/>
+        <w:ind w:left="7560" w:hanging="360"/>
       </w:pPr>
       <w:rPr>
         <w:rFonts w:ascii="Wingdings" w:hAnsi="Wingdings" w:hint="default"/>
@@ -5736,9 +6529,9 @@
       <w:lvlJc w:val="left"/>
       <w:pPr>
         <w:tabs>
-          <w:tab w:val="num" w:pos="6840"/>
+          <w:tab w:val="num" w:pos="8280"/>
         </w:tabs>
-        <w:ind w:left="6840" w:hanging="360"/>
+        <w:ind w:left="8280" w:hanging="360"/>
       </w:pPr>
       <w:rPr>
         <w:rFonts w:ascii="Wingdings" w:hAnsi="Wingdings" w:hint="default"/>
@@ -5746,7 +6539,7 @@
       </w:rPr>
     </w:lvl>
   </w:abstractNum>
-  <w:abstractNum w:abstractNumId="5" w15:restartNumberingAfterBreak="0">
+  <w:abstractNum w:abstractNumId="7" w15:restartNumberingAfterBreak="0">
     <w:nsid w:val="540A5BAB"/>
     <w:multiLevelType w:val="multilevel"/>
     <w:tmpl w:val="037028AA"/>
@@ -5895,7 +6688,7 @@
       </w:rPr>
     </w:lvl>
   </w:abstractNum>
-  <w:abstractNum w:abstractNumId="6" w15:restartNumberingAfterBreak="0">
+  <w:abstractNum w:abstractNumId="8" w15:restartNumberingAfterBreak="0">
     <w:nsid w:val="682C2F7D"/>
     <w:multiLevelType w:val="hybridMultilevel"/>
     <w:tmpl w:val="7902C802"/>
@@ -5984,32 +6777,376 @@
       </w:pPr>
     </w:lvl>
   </w:abstractNum>
-  <w:num w:numId="1">
+  <w:abstractNum w:abstractNumId="9" w15:restartNumberingAfterBreak="0">
+    <w:nsid w:val="68611AE4"/>
+    <w:multiLevelType w:val="hybridMultilevel"/>
+    <w:tmpl w:val="485C7634"/>
+    <w:lvl w:ilvl="0" w:tplc="FFFFFFFF">
+      <w:start w:val="1"/>
+      <w:numFmt w:val="decimal"/>
+      <w:lvlText w:val="%1."/>
+      <w:lvlJc w:val="left"/>
+      <w:pPr>
+        <w:ind w:left="720" w:hanging="360"/>
+      </w:pPr>
+      <w:rPr>
+        <w:rFonts w:hint="default"/>
+      </w:rPr>
+    </w:lvl>
+    <w:lvl w:ilvl="1" w:tplc="FFFFFFFF">
+      <w:start w:val="1"/>
+      <w:numFmt w:val="bullet"/>
+      <w:lvlText w:val=""/>
+      <w:lvlJc w:val="left"/>
+      <w:pPr>
+        <w:ind w:left="1440" w:hanging="360"/>
+      </w:pPr>
+      <w:rPr>
+        <w:rFonts w:ascii="Symbol" w:hAnsi="Symbol" w:hint="default"/>
+      </w:rPr>
+    </w:lvl>
+    <w:lvl w:ilvl="2" w:tplc="04090001">
+      <w:start w:val="1"/>
+      <w:numFmt w:val="bullet"/>
+      <w:lvlText w:val=""/>
+      <w:lvlJc w:val="left"/>
+      <w:pPr>
+        <w:ind w:left="2340" w:hanging="360"/>
+      </w:pPr>
+      <w:rPr>
+        <w:rFonts w:ascii="Symbol" w:hAnsi="Symbol" w:hint="default"/>
+      </w:rPr>
+    </w:lvl>
+    <w:lvl w:ilvl="3" w:tplc="FFFFFFFF" w:tentative="1">
+      <w:start w:val="1"/>
+      <w:numFmt w:val="decimal"/>
+      <w:lvlText w:val="%4."/>
+      <w:lvlJc w:val="left"/>
+      <w:pPr>
+        <w:ind w:left="2880" w:hanging="360"/>
+      </w:pPr>
+    </w:lvl>
+    <w:lvl w:ilvl="4" w:tplc="FFFFFFFF" w:tentative="1">
+      <w:start w:val="1"/>
+      <w:numFmt w:val="lowerLetter"/>
+      <w:lvlText w:val="%5."/>
+      <w:lvlJc w:val="left"/>
+      <w:pPr>
+        <w:ind w:left="3600" w:hanging="360"/>
+      </w:pPr>
+    </w:lvl>
+    <w:lvl w:ilvl="5" w:tplc="FFFFFFFF" w:tentative="1">
+      <w:start w:val="1"/>
+      <w:numFmt w:val="lowerRoman"/>
+      <w:lvlText w:val="%6."/>
+      <w:lvlJc w:val="right"/>
+      <w:pPr>
+        <w:ind w:left="4320" w:hanging="180"/>
+      </w:pPr>
+    </w:lvl>
+    <w:lvl w:ilvl="6" w:tplc="FFFFFFFF" w:tentative="1">
+      <w:start w:val="1"/>
+      <w:numFmt w:val="decimal"/>
+      <w:lvlText w:val="%7."/>
+      <w:lvlJc w:val="left"/>
+      <w:pPr>
+        <w:ind w:left="5040" w:hanging="360"/>
+      </w:pPr>
+    </w:lvl>
+    <w:lvl w:ilvl="7" w:tplc="FFFFFFFF" w:tentative="1">
+      <w:start w:val="1"/>
+      <w:numFmt w:val="lowerLetter"/>
+      <w:lvlText w:val="%8."/>
+      <w:lvlJc w:val="left"/>
+      <w:pPr>
+        <w:ind w:left="5760" w:hanging="360"/>
+      </w:pPr>
+    </w:lvl>
+    <w:lvl w:ilvl="8" w:tplc="FFFFFFFF" w:tentative="1">
+      <w:start w:val="1"/>
+      <w:numFmt w:val="lowerRoman"/>
+      <w:lvlText w:val="%9."/>
+      <w:lvlJc w:val="right"/>
+      <w:pPr>
+        <w:ind w:left="6480" w:hanging="180"/>
+      </w:pPr>
+    </w:lvl>
+  </w:abstractNum>
+  <w:abstractNum w:abstractNumId="10" w15:restartNumberingAfterBreak="0">
+    <w:nsid w:val="771D6808"/>
+    <w:multiLevelType w:val="hybridMultilevel"/>
+    <w:tmpl w:val="1D024CA2"/>
+    <w:lvl w:ilvl="0" w:tplc="FFFFFFFF">
+      <w:start w:val="1"/>
+      <w:numFmt w:val="lowerLetter"/>
+      <w:lvlText w:val="%1."/>
+      <w:lvlJc w:val="left"/>
+      <w:pPr>
+        <w:ind w:left="2160" w:hanging="360"/>
+      </w:pPr>
+      <w:rPr>
+        <w:rFonts w:hint="default"/>
+      </w:rPr>
+    </w:lvl>
+    <w:lvl w:ilvl="1" w:tplc="FFFFFFFF">
+      <w:start w:val="1"/>
+      <w:numFmt w:val="lowerLetter"/>
+      <w:lvlText w:val="%2."/>
+      <w:lvlJc w:val="left"/>
+      <w:pPr>
+        <w:ind w:left="2880" w:hanging="360"/>
+      </w:pPr>
+    </w:lvl>
+    <w:lvl w:ilvl="2" w:tplc="FFFFFFFF" w:tentative="1">
+      <w:start w:val="1"/>
+      <w:numFmt w:val="lowerRoman"/>
+      <w:lvlText w:val="%3."/>
+      <w:lvlJc w:val="right"/>
+      <w:pPr>
+        <w:ind w:left="3600" w:hanging="180"/>
+      </w:pPr>
+    </w:lvl>
+    <w:lvl w:ilvl="3" w:tplc="FFFFFFFF" w:tentative="1">
+      <w:start w:val="1"/>
+      <w:numFmt w:val="decimal"/>
+      <w:lvlText w:val="%4."/>
+      <w:lvlJc w:val="left"/>
+      <w:pPr>
+        <w:ind w:left="4320" w:hanging="360"/>
+      </w:pPr>
+    </w:lvl>
+    <w:lvl w:ilvl="4" w:tplc="FFFFFFFF" w:tentative="1">
+      <w:start w:val="1"/>
+      <w:numFmt w:val="lowerLetter"/>
+      <w:lvlText w:val="%5."/>
+      <w:lvlJc w:val="left"/>
+      <w:pPr>
+        <w:ind w:left="5040" w:hanging="360"/>
+      </w:pPr>
+    </w:lvl>
+    <w:lvl w:ilvl="5" w:tplc="FFFFFFFF" w:tentative="1">
+      <w:start w:val="1"/>
+      <w:numFmt w:val="lowerRoman"/>
+      <w:lvlText w:val="%6."/>
+      <w:lvlJc w:val="right"/>
+      <w:pPr>
+        <w:ind w:left="5760" w:hanging="180"/>
+      </w:pPr>
+    </w:lvl>
+    <w:lvl w:ilvl="6" w:tplc="FFFFFFFF" w:tentative="1">
+      <w:start w:val="1"/>
+      <w:numFmt w:val="decimal"/>
+      <w:lvlText w:val="%7."/>
+      <w:lvlJc w:val="left"/>
+      <w:pPr>
+        <w:ind w:left="6480" w:hanging="360"/>
+      </w:pPr>
+    </w:lvl>
+    <w:lvl w:ilvl="7" w:tplc="FFFFFFFF" w:tentative="1">
+      <w:start w:val="1"/>
+      <w:numFmt w:val="lowerLetter"/>
+      <w:lvlText w:val="%8."/>
+      <w:lvlJc w:val="left"/>
+      <w:pPr>
+        <w:ind w:left="7200" w:hanging="360"/>
+      </w:pPr>
+    </w:lvl>
+    <w:lvl w:ilvl="8" w:tplc="FFFFFFFF" w:tentative="1">
+      <w:start w:val="1"/>
+      <w:numFmt w:val="lowerRoman"/>
+      <w:lvlText w:val="%9."/>
+      <w:lvlJc w:val="right"/>
+      <w:pPr>
+        <w:ind w:left="7920" w:hanging="180"/>
+      </w:pPr>
+    </w:lvl>
+  </w:abstractNum>
+  <w:abstractNum w:abstractNumId="11" w15:restartNumberingAfterBreak="0">
+    <w:nsid w:val="7A0E3280"/>
+    <w:multiLevelType w:val="multilevel"/>
+    <w:tmpl w:val="0B9CCF96"/>
+    <w:lvl w:ilvl="0">
+      <w:start w:val="1"/>
+      <w:numFmt w:val="bullet"/>
+      <w:lvlText w:val=""/>
+      <w:lvlJc w:val="left"/>
+      <w:pPr>
+        <w:tabs>
+          <w:tab w:val="num" w:pos="720"/>
+        </w:tabs>
+        <w:ind w:left="720" w:hanging="360"/>
+      </w:pPr>
+      <w:rPr>
+        <w:rFonts w:ascii="Symbol" w:hAnsi="Symbol" w:hint="default"/>
+        <w:sz w:val="20"/>
+      </w:rPr>
+    </w:lvl>
+    <w:lvl w:ilvl="1">
+      <w:start w:val="1"/>
+      <w:numFmt w:val="decimal"/>
+      <w:lvlText w:val="%2."/>
+      <w:lvlJc w:val="left"/>
+      <w:pPr>
+        <w:ind w:left="1440" w:hanging="360"/>
+      </w:pPr>
+      <w:rPr>
+        <w:rFonts w:hint="default"/>
+      </w:rPr>
+    </w:lvl>
+    <w:lvl w:ilvl="2" w:tentative="1">
+      <w:start w:val="1"/>
+      <w:numFmt w:val="bullet"/>
+      <w:lvlText w:val=""/>
+      <w:lvlJc w:val="left"/>
+      <w:pPr>
+        <w:tabs>
+          <w:tab w:val="num" w:pos="2160"/>
+        </w:tabs>
+        <w:ind w:left="2160" w:hanging="360"/>
+      </w:pPr>
+      <w:rPr>
+        <w:rFonts w:ascii="Wingdings" w:hAnsi="Wingdings" w:hint="default"/>
+        <w:sz w:val="20"/>
+      </w:rPr>
+    </w:lvl>
+    <w:lvl w:ilvl="3" w:tentative="1">
+      <w:start w:val="1"/>
+      <w:numFmt w:val="bullet"/>
+      <w:lvlText w:val=""/>
+      <w:lvlJc w:val="left"/>
+      <w:pPr>
+        <w:tabs>
+          <w:tab w:val="num" w:pos="2880"/>
+        </w:tabs>
+        <w:ind w:left="2880" w:hanging="360"/>
+      </w:pPr>
+      <w:rPr>
+        <w:rFonts w:ascii="Wingdings" w:hAnsi="Wingdings" w:hint="default"/>
+        <w:sz w:val="20"/>
+      </w:rPr>
+    </w:lvl>
+    <w:lvl w:ilvl="4" w:tentative="1">
+      <w:start w:val="1"/>
+      <w:numFmt w:val="bullet"/>
+      <w:lvlText w:val=""/>
+      <w:lvlJc w:val="left"/>
+      <w:pPr>
+        <w:tabs>
+          <w:tab w:val="num" w:pos="3600"/>
+        </w:tabs>
+        <w:ind w:left="3600" w:hanging="360"/>
+      </w:pPr>
+      <w:rPr>
+        <w:rFonts w:ascii="Wingdings" w:hAnsi="Wingdings" w:hint="default"/>
+        <w:sz w:val="20"/>
+      </w:rPr>
+    </w:lvl>
+    <w:lvl w:ilvl="5" w:tentative="1">
+      <w:start w:val="1"/>
+      <w:numFmt w:val="bullet"/>
+      <w:lvlText w:val=""/>
+      <w:lvlJc w:val="left"/>
+      <w:pPr>
+        <w:tabs>
+          <w:tab w:val="num" w:pos="4320"/>
+        </w:tabs>
+        <w:ind w:left="4320" w:hanging="360"/>
+      </w:pPr>
+      <w:rPr>
+        <w:rFonts w:ascii="Wingdings" w:hAnsi="Wingdings" w:hint="default"/>
+        <w:sz w:val="20"/>
+      </w:rPr>
+    </w:lvl>
+    <w:lvl w:ilvl="6" w:tentative="1">
+      <w:start w:val="1"/>
+      <w:numFmt w:val="bullet"/>
+      <w:lvlText w:val=""/>
+      <w:lvlJc w:val="left"/>
+      <w:pPr>
+        <w:tabs>
+          <w:tab w:val="num" w:pos="5040"/>
+        </w:tabs>
+        <w:ind w:left="5040" w:hanging="360"/>
+      </w:pPr>
+      <w:rPr>
+        <w:rFonts w:ascii="Wingdings" w:hAnsi="Wingdings" w:hint="default"/>
+        <w:sz w:val="20"/>
+      </w:rPr>
+    </w:lvl>
+    <w:lvl w:ilvl="7" w:tentative="1">
+      <w:start w:val="1"/>
+      <w:numFmt w:val="bullet"/>
+      <w:lvlText w:val=""/>
+      <w:lvlJc w:val="left"/>
+      <w:pPr>
+        <w:tabs>
+          <w:tab w:val="num" w:pos="5760"/>
+        </w:tabs>
+        <w:ind w:left="5760" w:hanging="360"/>
+      </w:pPr>
+      <w:rPr>
+        <w:rFonts w:ascii="Wingdings" w:hAnsi="Wingdings" w:hint="default"/>
+        <w:sz w:val="20"/>
+      </w:rPr>
+    </w:lvl>
+    <w:lvl w:ilvl="8" w:tentative="1">
+      <w:start w:val="1"/>
+      <w:numFmt w:val="bullet"/>
+      <w:lvlText w:val=""/>
+      <w:lvlJc w:val="left"/>
+      <w:pPr>
+        <w:tabs>
+          <w:tab w:val="num" w:pos="6480"/>
+        </w:tabs>
+        <w:ind w:left="6480" w:hanging="360"/>
+      </w:pPr>
+      <w:rPr>
+        <w:rFonts w:ascii="Wingdings" w:hAnsi="Wingdings" w:hint="default"/>
+        <w:sz w:val="20"/>
+      </w:rPr>
+    </w:lvl>
+  </w:abstractNum>
+  <w:num w:numId="1" w16cid:durableId="1818493500">
+    <w:abstractNumId w:val="8"/>
+  </w:num>
+  <w:num w:numId="2" w16cid:durableId="264654575">
+    <w:abstractNumId w:val="0"/>
+  </w:num>
+  <w:num w:numId="3" w16cid:durableId="1633562900">
+    <w:abstractNumId w:val="7"/>
+  </w:num>
+  <w:num w:numId="4" w16cid:durableId="1905530153">
+    <w:abstractNumId w:val="2"/>
+  </w:num>
+  <w:num w:numId="5" w16cid:durableId="450251488">
+    <w:abstractNumId w:val="3"/>
+  </w:num>
+  <w:num w:numId="6" w16cid:durableId="56516590">
     <w:abstractNumId w:val="6"/>
   </w:num>
-  <w:num w:numId="2">
-    <w:abstractNumId w:val="0"/>
-  </w:num>
-  <w:num w:numId="3">
+  <w:num w:numId="7" w16cid:durableId="422648819">
     <w:abstractNumId w:val="5"/>
   </w:num>
-  <w:num w:numId="4">
+  <w:num w:numId="8" w16cid:durableId="162668735">
+    <w:abstractNumId w:val="4"/>
+  </w:num>
+  <w:num w:numId="9" w16cid:durableId="1044477954">
+    <w:abstractNumId w:val="11"/>
+  </w:num>
+  <w:num w:numId="10" w16cid:durableId="1755738407">
     <w:abstractNumId w:val="1"/>
   </w:num>
-  <w:num w:numId="5">
-    <w:abstractNumId w:val="2"/>
+  <w:num w:numId="11" w16cid:durableId="1116756248">
+    <w:abstractNumId w:val="10"/>
   </w:num>
-  <w:num w:numId="6">
-    <w:abstractNumId w:val="4"/>
-  </w:num>
-  <w:num w:numId="7">
-    <w:abstractNumId w:val="3"/>
+  <w:num w:numId="12" w16cid:durableId="1318998495">
+    <w:abstractNumId w:val="9"/>
   </w:num>
 </w:numbering>
 </file>
 
 <file path=word/styles.xml><?xml version="1.0" encoding="utf-8"?>
-<w:styles xmlns:mc="http://schemas.openxmlformats.org/markup-compatibility/2006" xmlns:r="http://schemas.openxmlformats.org/officeDocument/2006/relationships" xmlns:w="http://schemas.openxmlformats.org/wordprocessingml/2006/main" xmlns:w14="http://schemas.microsoft.com/office/word/2010/wordml" xmlns:w15="http://schemas.microsoft.com/office/word/2012/wordml" xmlns:w16se="http://schemas.microsoft.com/office/word/2015/wordml/symex" mc:Ignorable="w14 w15 w16se">
+<w:styles xmlns:mc="http://schemas.openxmlformats.org/markup-compatibility/2006" xmlns:r="http://schemas.openxmlformats.org/officeDocument/2006/relationships" xmlns:w="http://schemas.openxmlformats.org/wordprocessingml/2006/main" xmlns:w14="http://schemas.microsoft.com/office/word/2010/wordml" xmlns:w15="http://schemas.microsoft.com/office/word/2012/wordml" xmlns:w16cex="http://schemas.microsoft.com/office/word/2018/wordml/cex" xmlns:w16cid="http://schemas.microsoft.com/office/word/2016/wordml/cid" xmlns:w16="http://schemas.microsoft.com/office/word/2018/wordml" xmlns:w16du="http://schemas.microsoft.com/office/word/2023/wordml/word16du" xmlns:w16sdtdh="http://schemas.microsoft.com/office/word/2020/wordml/sdtdatahash" xmlns:w16sdtfl="http://schemas.microsoft.com/office/word/2024/wordml/sdtformatlock" xmlns:w16se="http://schemas.microsoft.com/office/word/2015/wordml/symex" mc:Ignorable="w14 w15 w16se w16cid w16 w16cex w16sdtdh w16sdtfl w16du">
   <w:docDefaults>
     <w:rPrDefault>
       <w:rPr>
@@ -6027,7 +7164,7 @@
       </w:pPr>
     </w:pPrDefault>
   </w:docDefaults>
-  <w:latentStyles w:defLockedState="0" w:defUIPriority="99" w:defSemiHidden="0" w:defUnhideWhenUsed="0" w:defQFormat="0" w:count="371">
+  <w:latentStyles w:defLockedState="0" w:defUIPriority="99" w:defSemiHidden="0" w:defUnhideWhenUsed="0" w:defQFormat="0" w:count="376">
     <w:lsdException w:name="Normal" w:uiPriority="0" w:qFormat="1"/>
     <w:lsdException w:name="heading 1" w:uiPriority="9" w:qFormat="1"/>
     <w:lsdException w:name="heading 2" w:semiHidden="1" w:uiPriority="9" w:unhideWhenUsed="1" w:qFormat="1"/>
@@ -6399,6 +7536,11 @@
     <w:lsdException w:name="List Table 5 Dark Accent 6" w:uiPriority="50"/>
     <w:lsdException w:name="List Table 6 Colorful Accent 6" w:uiPriority="51"/>
     <w:lsdException w:name="List Table 7 Colorful Accent 6" w:uiPriority="52"/>
+    <w:lsdException w:name="Mention" w:semiHidden="1" w:unhideWhenUsed="1"/>
+    <w:lsdException w:name="Smart Hyperlink" w:semiHidden="1" w:unhideWhenUsed="1"/>
+    <w:lsdException w:name="Hashtag" w:semiHidden="1" w:unhideWhenUsed="1"/>
+    <w:lsdException w:name="Unresolved Mention" w:semiHidden="1" w:unhideWhenUsed="1"/>
+    <w:lsdException w:name="Smart Link" w:semiHidden="1" w:unhideWhenUsed="1"/>
   </w:latentStyles>
   <w:style w:type="paragraph" w:default="1" w:styleId="Normal">
     <w:name w:val="Normal"/>
@@ -6607,6 +7749,7 @@
   <w:style w:type="character" w:default="1" w:styleId="DefaultParagraphFont">
     <w:name w:val="Default Paragraph Font"/>
     <w:uiPriority w:val="1"/>
+    <w:semiHidden/>
     <w:unhideWhenUsed/>
   </w:style>
   <w:style w:type="table" w:default="1" w:styleId="TableNormal">

</xml_diff>